<commit_message>
Make table headers black instead of blue, keep the added-row highlight
</commit_message>
<xml_diff>
--- a/report/CSE332_Assignment5_Report.docx
+++ b/report/CSE332_Assignment5_Report.docx
@@ -810,7 +810,7 @@
         <w:tc>
           <w:tcPr>
             <w:tcW w:type="dxa" w:w="1815"/>
-            <w:shd w:fill="1F3B63" w:val="clear"/>
+            <w:shd w:fill="000000" w:val="clear"/>
             <w:tcMar>
               <w:top w:type="dxa" w:w="30"/>
               <w:left w:type="dxa" w:w="40"/>
@@ -838,7 +838,7 @@
         <w:tc>
           <w:tcPr>
             <w:tcW w:type="dxa" w:w="682"/>
-            <w:shd w:fill="1F3B63" w:val="clear"/>
+            <w:shd w:fill="000000" w:val="clear"/>
             <w:tcMar>
               <w:top w:type="dxa" w:w="30"/>
               <w:left w:type="dxa" w:w="40"/>
@@ -866,7 +866,7 @@
         <w:tc>
           <w:tcPr>
             <w:tcW w:type="dxa" w:w="682"/>
-            <w:shd w:fill="1F3B63" w:val="clear"/>
+            <w:shd w:fill="000000" w:val="clear"/>
             <w:tcMar>
               <w:top w:type="dxa" w:w="30"/>
               <w:left w:type="dxa" w:w="40"/>
@@ -894,7 +894,7 @@
         <w:tc>
           <w:tcPr>
             <w:tcW w:type="dxa" w:w="770"/>
-            <w:shd w:fill="1F3B63" w:val="clear"/>
+            <w:shd w:fill="000000" w:val="clear"/>
             <w:tcMar>
               <w:top w:type="dxa" w:w="30"/>
               <w:left w:type="dxa" w:w="40"/>
@@ -922,7 +922,7 @@
         <w:tc>
           <w:tcPr>
             <w:tcW w:type="dxa" w:w="770"/>
-            <w:shd w:fill="1F3B63" w:val="clear"/>
+            <w:shd w:fill="000000" w:val="clear"/>
             <w:tcMar>
               <w:top w:type="dxa" w:w="30"/>
               <w:left w:type="dxa" w:w="40"/>
@@ -950,7 +950,7 @@
         <w:tc>
           <w:tcPr>
             <w:tcW w:type="dxa" w:w="770"/>
-            <w:shd w:fill="1F3B63" w:val="clear"/>
+            <w:shd w:fill="000000" w:val="clear"/>
             <w:tcMar>
               <w:top w:type="dxa" w:w="30"/>
               <w:left w:type="dxa" w:w="40"/>
@@ -978,7 +978,7 @@
         <w:tc>
           <w:tcPr>
             <w:tcW w:type="dxa" w:w="770"/>
-            <w:shd w:fill="1F3B63" w:val="clear"/>
+            <w:shd w:fill="000000" w:val="clear"/>
             <w:tcMar>
               <w:top w:type="dxa" w:w="30"/>
               <w:left w:type="dxa" w:w="40"/>
@@ -1006,7 +1006,7 @@
         <w:tc>
           <w:tcPr>
             <w:tcW w:type="dxa" w:w="616"/>
-            <w:shd w:fill="1F3B63" w:val="clear"/>
+            <w:shd w:fill="000000" w:val="clear"/>
             <w:tcMar>
               <w:top w:type="dxa" w:w="30"/>
               <w:left w:type="dxa" w:w="40"/>
@@ -1034,7 +1034,7 @@
         <w:tc>
           <w:tcPr>
             <w:tcW w:type="dxa" w:w="572"/>
-            <w:shd w:fill="1F3B63" w:val="clear"/>
+            <w:shd w:fill="000000" w:val="clear"/>
             <w:tcMar>
               <w:top w:type="dxa" w:w="30"/>
               <w:left w:type="dxa" w:w="40"/>
@@ -1062,7 +1062,7 @@
         <w:tc>
           <w:tcPr>
             <w:tcW w:type="dxa" w:w="528"/>
-            <w:shd w:fill="1F3B63" w:val="clear"/>
+            <w:shd w:fill="000000" w:val="clear"/>
             <w:tcMar>
               <w:top w:type="dxa" w:w="30"/>
               <w:left w:type="dxa" w:w="40"/>
@@ -1090,7 +1090,7 @@
         <w:tc>
           <w:tcPr>
             <w:tcW w:type="dxa" w:w="726"/>
-            <w:shd w:fill="1F3B63" w:val="clear"/>
+            <w:shd w:fill="000000" w:val="clear"/>
             <w:tcMar>
               <w:top w:type="dxa" w:w="30"/>
               <w:left w:type="dxa" w:w="40"/>
@@ -1118,7 +1118,7 @@
         <w:tc>
           <w:tcPr>
             <w:tcW w:type="dxa" w:w="748"/>
-            <w:shd w:fill="1F3B63" w:val="clear"/>
+            <w:shd w:fill="000000" w:val="clear"/>
             <w:tcMar>
               <w:top w:type="dxa" w:w="30"/>
               <w:left w:type="dxa" w:w="40"/>
@@ -1146,7 +1146,7 @@
         <w:tc>
           <w:tcPr>
             <w:tcW w:type="dxa" w:w="770"/>
-            <w:shd w:fill="1F3B63" w:val="clear"/>
+            <w:shd w:fill="000000" w:val="clear"/>
             <w:tcMar>
               <w:top w:type="dxa" w:w="30"/>
               <w:left w:type="dxa" w:w="40"/>
@@ -9919,7 +9919,7 @@
         <w:tc>
           <w:tcPr>
             <w:tcW w:type="dxa" w:w="2500"/>
-            <w:shd w:fill="1F3B63" w:val="clear"/>
+            <w:shd w:fill="000000" w:val="clear"/>
             <w:tcMar>
               <w:top w:type="dxa" w:w="45"/>
               <w:left w:type="dxa" w:w="90"/>
@@ -9943,7 +9943,7 @@
         <w:tc>
           <w:tcPr>
             <w:tcW w:type="dxa" w:w="2200"/>
-            <w:shd w:fill="1F3B63" w:val="clear"/>
+            <w:shd w:fill="000000" w:val="clear"/>
             <w:tcMar>
               <w:top w:type="dxa" w:w="45"/>
               <w:left w:type="dxa" w:w="90"/>
@@ -9967,7 +9967,7 @@
         <w:tc>
           <w:tcPr>
             <w:tcW w:type="dxa" w:w="5500"/>
-            <w:shd w:fill="1F3B63" w:val="clear"/>
+            <w:shd w:fill="000000" w:val="clear"/>
             <w:tcMar>
               <w:top w:type="dxa" w:w="45"/>
               <w:left w:type="dxa" w:w="90"/>

</xml_diff>

<commit_message>
Remove background color from table header rows
</commit_message>
<xml_diff>
--- a/report/CSE332_Assignment5_Report.docx
+++ b/report/CSE332_Assignment5_Report.docx
@@ -810,7 +810,6 @@
         <w:tc>
           <w:tcPr>
             <w:tcW w:type="dxa" w:w="1815"/>
-            <w:shd w:fill="000000" w:val="clear"/>
             <w:tcMar>
               <w:top w:type="dxa" w:w="30"/>
               <w:left w:type="dxa" w:w="40"/>
@@ -827,7 +826,6 @@
               <w:rPr>
                 <w:b/>
                 <w:bCs/>
-                <w:color w:val="FFFFFF"/>
                 <w:sz w:val="14"/>
                 <w:szCs w:val="14"/>
               </w:rPr>
@@ -838,7 +836,6 @@
         <w:tc>
           <w:tcPr>
             <w:tcW w:type="dxa" w:w="682"/>
-            <w:shd w:fill="000000" w:val="clear"/>
             <w:tcMar>
               <w:top w:type="dxa" w:w="30"/>
               <w:left w:type="dxa" w:w="40"/>
@@ -855,7 +852,6 @@
               <w:rPr>
                 <w:b/>
                 <w:bCs/>
-                <w:color w:val="FFFFFF"/>
                 <w:sz w:val="14"/>
                 <w:szCs w:val="14"/>
               </w:rPr>
@@ -866,7 +862,6 @@
         <w:tc>
           <w:tcPr>
             <w:tcW w:type="dxa" w:w="682"/>
-            <w:shd w:fill="000000" w:val="clear"/>
             <w:tcMar>
               <w:top w:type="dxa" w:w="30"/>
               <w:left w:type="dxa" w:w="40"/>
@@ -883,7 +878,6 @@
               <w:rPr>
                 <w:b/>
                 <w:bCs/>
-                <w:color w:val="FFFFFF"/>
                 <w:sz w:val="14"/>
                 <w:szCs w:val="14"/>
               </w:rPr>
@@ -894,7 +888,6 @@
         <w:tc>
           <w:tcPr>
             <w:tcW w:type="dxa" w:w="770"/>
-            <w:shd w:fill="000000" w:val="clear"/>
             <w:tcMar>
               <w:top w:type="dxa" w:w="30"/>
               <w:left w:type="dxa" w:w="40"/>
@@ -911,7 +904,6 @@
               <w:rPr>
                 <w:b/>
                 <w:bCs/>
-                <w:color w:val="FFFFFF"/>
                 <w:sz w:val="14"/>
                 <w:szCs w:val="14"/>
               </w:rPr>
@@ -922,7 +914,6 @@
         <w:tc>
           <w:tcPr>
             <w:tcW w:type="dxa" w:w="770"/>
-            <w:shd w:fill="000000" w:val="clear"/>
             <w:tcMar>
               <w:top w:type="dxa" w:w="30"/>
               <w:left w:type="dxa" w:w="40"/>
@@ -939,7 +930,6 @@
               <w:rPr>
                 <w:b/>
                 <w:bCs/>
-                <w:color w:val="FFFFFF"/>
                 <w:sz w:val="14"/>
                 <w:szCs w:val="14"/>
               </w:rPr>
@@ -950,7 +940,6 @@
         <w:tc>
           <w:tcPr>
             <w:tcW w:type="dxa" w:w="770"/>
-            <w:shd w:fill="000000" w:val="clear"/>
             <w:tcMar>
               <w:top w:type="dxa" w:w="30"/>
               <w:left w:type="dxa" w:w="40"/>
@@ -967,7 +956,6 @@
               <w:rPr>
                 <w:b/>
                 <w:bCs/>
-                <w:color w:val="FFFFFF"/>
                 <w:sz w:val="14"/>
                 <w:szCs w:val="14"/>
               </w:rPr>
@@ -978,7 +966,6 @@
         <w:tc>
           <w:tcPr>
             <w:tcW w:type="dxa" w:w="770"/>
-            <w:shd w:fill="000000" w:val="clear"/>
             <w:tcMar>
               <w:top w:type="dxa" w:w="30"/>
               <w:left w:type="dxa" w:w="40"/>
@@ -995,7 +982,6 @@
               <w:rPr>
                 <w:b/>
                 <w:bCs/>
-                <w:color w:val="FFFFFF"/>
                 <w:sz w:val="14"/>
                 <w:szCs w:val="14"/>
               </w:rPr>
@@ -1006,7 +992,6 @@
         <w:tc>
           <w:tcPr>
             <w:tcW w:type="dxa" w:w="616"/>
-            <w:shd w:fill="000000" w:val="clear"/>
             <w:tcMar>
               <w:top w:type="dxa" w:w="30"/>
               <w:left w:type="dxa" w:w="40"/>
@@ -1023,7 +1008,6 @@
               <w:rPr>
                 <w:b/>
                 <w:bCs/>
-                <w:color w:val="FFFFFF"/>
                 <w:sz w:val="14"/>
                 <w:szCs w:val="14"/>
               </w:rPr>
@@ -1034,7 +1018,6 @@
         <w:tc>
           <w:tcPr>
             <w:tcW w:type="dxa" w:w="572"/>
-            <w:shd w:fill="000000" w:val="clear"/>
             <w:tcMar>
               <w:top w:type="dxa" w:w="30"/>
               <w:left w:type="dxa" w:w="40"/>
@@ -1051,7 +1034,6 @@
               <w:rPr>
                 <w:b/>
                 <w:bCs/>
-                <w:color w:val="FFFFFF"/>
                 <w:sz w:val="14"/>
                 <w:szCs w:val="14"/>
               </w:rPr>
@@ -1062,7 +1044,6 @@
         <w:tc>
           <w:tcPr>
             <w:tcW w:type="dxa" w:w="528"/>
-            <w:shd w:fill="000000" w:val="clear"/>
             <w:tcMar>
               <w:top w:type="dxa" w:w="30"/>
               <w:left w:type="dxa" w:w="40"/>
@@ -1079,7 +1060,6 @@
               <w:rPr>
                 <w:b/>
                 <w:bCs/>
-                <w:color w:val="FFFFFF"/>
                 <w:sz w:val="14"/>
                 <w:szCs w:val="14"/>
               </w:rPr>
@@ -1090,7 +1070,6 @@
         <w:tc>
           <w:tcPr>
             <w:tcW w:type="dxa" w:w="726"/>
-            <w:shd w:fill="000000" w:val="clear"/>
             <w:tcMar>
               <w:top w:type="dxa" w:w="30"/>
               <w:left w:type="dxa" w:w="40"/>
@@ -1107,7 +1086,6 @@
               <w:rPr>
                 <w:b/>
                 <w:bCs/>
-                <w:color w:val="FFFFFF"/>
                 <w:sz w:val="14"/>
                 <w:szCs w:val="14"/>
               </w:rPr>
@@ -1118,7 +1096,6 @@
         <w:tc>
           <w:tcPr>
             <w:tcW w:type="dxa" w:w="748"/>
-            <w:shd w:fill="000000" w:val="clear"/>
             <w:tcMar>
               <w:top w:type="dxa" w:w="30"/>
               <w:left w:type="dxa" w:w="40"/>
@@ -1135,7 +1112,6 @@
               <w:rPr>
                 <w:b/>
                 <w:bCs/>
-                <w:color w:val="FFFFFF"/>
                 <w:sz w:val="14"/>
                 <w:szCs w:val="14"/>
               </w:rPr>
@@ -1146,7 +1122,6 @@
         <w:tc>
           <w:tcPr>
             <w:tcW w:type="dxa" w:w="770"/>
-            <w:shd w:fill="000000" w:val="clear"/>
             <w:tcMar>
               <w:top w:type="dxa" w:w="30"/>
               <w:left w:type="dxa" w:w="40"/>
@@ -1163,7 +1138,6 @@
               <w:rPr>
                 <w:b/>
                 <w:bCs/>
-                <w:color w:val="FFFFFF"/>
                 <w:sz w:val="14"/>
                 <w:szCs w:val="14"/>
               </w:rPr>
@@ -9919,7 +9893,6 @@
         <w:tc>
           <w:tcPr>
             <w:tcW w:type="dxa" w:w="2500"/>
-            <w:shd w:fill="000000" w:val="clear"/>
             <w:tcMar>
               <w:top w:type="dxa" w:w="45"/>
               <w:left w:type="dxa" w:w="90"/>
@@ -9932,7 +9905,6 @@
               <w:rPr>
                 <w:b/>
                 <w:bCs/>
-                <w:color w:val="FFFFFF"/>
                 <w:sz w:val="16"/>
                 <w:szCs w:val="16"/>
               </w:rPr>
@@ -9943,7 +9915,6 @@
         <w:tc>
           <w:tcPr>
             <w:tcW w:type="dxa" w:w="2200"/>
-            <w:shd w:fill="000000" w:val="clear"/>
             <w:tcMar>
               <w:top w:type="dxa" w:w="45"/>
               <w:left w:type="dxa" w:w="90"/>
@@ -9956,7 +9927,6 @@
               <w:rPr>
                 <w:b/>
                 <w:bCs/>
-                <w:color w:val="FFFFFF"/>
                 <w:sz w:val="16"/>
                 <w:szCs w:val="16"/>
               </w:rPr>
@@ -9967,7 +9937,6 @@
         <w:tc>
           <w:tcPr>
             <w:tcW w:type="dxa" w:w="5500"/>
-            <w:shd w:fill="000000" w:val="clear"/>
             <w:tcMar>
               <w:top w:type="dxa" w:w="45"/>
               <w:left w:type="dxa" w:w="90"/>
@@ -9980,7 +9949,6 @@
               <w:rPr>
                 <w:b/>
                 <w:bCs/>
-                <w:color w:val="FFFFFF"/>
                 <w:sz w:val="16"/>
                 <w:szCs w:val="16"/>
               </w:rPr>

</xml_diff>

<commit_message>
Fill in group member names and student IDs
</commit_message>
<xml_diff>
--- a/report/CSE332_Assignment5_Report.docx
+++ b/report/CSE332_Assignment5_Report.docx
@@ -90,7 +90,7 @@
                 <w:sz w:val="19"/>
                 <w:szCs w:val="19"/>
               </w:rPr>
-              <w:t xml:space="preserve">Name  ______________________________</w:t>
+              <w:t xml:space="preserve">Name  Mustakim Ahmed Hasan</w:t>
             </w:r>
           </w:p>
           <w:p>
@@ -103,7 +103,7 @@
                 <w:sz w:val="19"/>
                 <w:szCs w:val="19"/>
               </w:rPr>
-              <w:t xml:space="preserve">Student ID  _________________________</w:t>
+              <w:t xml:space="preserve">Student ID  2421349042</w:t>
             </w:r>
           </w:p>
         </w:tc>
@@ -148,7 +148,7 @@
                 <w:sz w:val="19"/>
                 <w:szCs w:val="19"/>
               </w:rPr>
-              <w:t xml:space="preserve">Name  ______________________________</w:t>
+              <w:t xml:space="preserve">Name  Md. Rafiul Haque</w:t>
             </w:r>
           </w:p>
           <w:p>
@@ -161,7 +161,7 @@
                 <w:sz w:val="19"/>
                 <w:szCs w:val="19"/>
               </w:rPr>
-              <w:t xml:space="preserve">Student ID  _________________________</w:t>
+              <w:t xml:space="preserve">Student ID  2413697042</w:t>
             </w:r>
           </w:p>
         </w:tc>
@@ -208,7 +208,7 @@
                 <w:sz w:val="19"/>
                 <w:szCs w:val="19"/>
               </w:rPr>
-              <w:t xml:space="preserve">Name  ______________________________</w:t>
+              <w:t xml:space="preserve">Name  Md Ashikur Rahman</w:t>
             </w:r>
           </w:p>
           <w:p>
@@ -221,7 +221,7 @@
                 <w:sz w:val="19"/>
                 <w:szCs w:val="19"/>
               </w:rPr>
-              <w:t xml:space="preserve">Student ID  _________________________</w:t>
+              <w:t xml:space="preserve">Student ID  2411632642</w:t>
             </w:r>
           </w:p>
         </w:tc>
@@ -266,7 +266,7 @@
                 <w:sz w:val="19"/>
                 <w:szCs w:val="19"/>
               </w:rPr>
-              <w:t xml:space="preserve">Name  ______________________________</w:t>
+              <w:t xml:space="preserve">Name  Sami Hyder Chowdhury</w:t>
             </w:r>
           </w:p>
           <w:p>
@@ -279,7 +279,7 @@
                 <w:sz w:val="19"/>
                 <w:szCs w:val="19"/>
               </w:rPr>
-              <w:t xml:space="preserve">Student ID  _________________________</w:t>
+              <w:t xml:space="preserve">Student ID  2132720642</w:t>
             </w:r>
           </w:p>
         </w:tc>

</xml_diff>

<commit_message>
Add MIN, MAX and SUM coverage to the report, including the dmem dump
- Title, abstract and conclusion updated to cover all eight instructions
- New section III.D explaining why these three needed no control signals
  and why ALUControl had to be widened from four bits to five
- Truth table gains three rows, and every existing ALUcont value is
  rewritten to five bits to match the widened field
- Encoding table gains the three new instructions, hex verified against
  the assembler output rather than worked out by hand
- Testing section now includes the data memory dump contents, with the
  signed comparison result called out as the part that actually proves
  MIN and MAX are signed rather than unsigned
- Fixed stale 4-bit ALUControl literals in the older code excerpts, which
  no longer matched the source after the widening

Co-Authored-By: Claude Opus 5 <noreply@anthropic.com>
</commit_message>
<xml_diff>
--- a/report/CSE332_Assignment5_Report.docx
+++ b/report/CSE332_Assignment5_Report.docx
@@ -11,10 +11,10 @@
         <w:rPr>
           <w:b/>
           <w:bCs/>
-          <w:sz w:val="34"/>
-          <w:szCs w:val="34"/>
+          <w:sz w:val="32"/>
+          <w:szCs w:val="32"/>
         </w:rPr>
-        <w:t xml:space="preserve">Extending a Single Cycle MIPS Processor with JAL, JR, MULT, MFHI and MFLO</w:t>
+        <w:t xml:space="preserve">Extending a Single Cycle MIPS Processor with JAL, JR, MULT, MFHI, MFLO, MIN, MAX and SUM</w:t>
       </w:r>
     </w:p>
     <w:p>
@@ -324,7 +324,7 @@
           <w:sz w:val="19"/>
           <w:szCs w:val="19"/>
         </w:rPr>
-        <w:t xml:space="preserve">This report describes the work we did to extend a single cycle MIPS processor written in Verilog. The design we were given already handled the shift instructions SLL and SRL, but it had no support for jump and link or for jump register, and it had no multiply unit at all. We added JAL, JR, MULT, MFHI and MFLO. Most of the work sits in the control unit, although each new instruction also needs a small amount of extra hardware in the datapath. We give the full control signal truth table, two annotated figures showing what we added, worked encoding examples taken from a real assembler, and the results we measured after running test programs on the finished processor. Every value the processor produced matched what we had worked out by hand.</w:t>
+        <w:t xml:space="preserve">This report describes the work we did to extend a single cycle MIPS processor written in Verilog. The design we were given already handled the shift instructions SLL and SRL, but it had no support for jump and link or for jump register, and it had no multiply unit at all. We added JAL, JR, MULT, MFHI and MFLO, and then three custom instructions of our own called MIN, MAX and SUM. Most of the work sits in the control unit, although each new instruction also needs a varying amount of extra hardware in the datapath, ranging from none at all for MIN and MAX up to a whole multiplier and a new pair of registers for MULT. We give the full control signal truth table, two annotated figures showing what we added, worked encoding examples taken from a real assembler, and the results we measured after running test programs on the finished processor. Every value the processor produced matched what we had worked out by hand.</w:t>
       </w:r>
     </w:p>
     <w:p>
@@ -481,6 +481,20 @@
     </w:p>
     <w:p>
       <w:pPr>
+        <w:spacing w:after="100" w:line="230"/>
+        <w:ind w:firstLine="200"/>
+        <w:jc w:val="both"/>
+      </w:pPr>
+      <w:r>
+        <w:rPr>
+          <w:sz w:val="19"/>
+          <w:szCs w:val="19"/>
+        </w:rPr>
+        <w:t xml:space="preserve">MIN, MAX and SUM are not part of the MIPS instruction set at all. They are custom instructions we added on top. MIN writes the smaller of its two source registers into rd and MAX writes the larger, both treating the values as signed. SUM writes the sum of the two source registers into rd. It is worth being upfront that SUM performs exactly the same operation as ADD. It exists as a separately decoded instruction with its own function code rather than as a genuinely new operation.</w:t>
+      </w:r>
+    </w:p>
+    <w:p>
+      <w:pPr>
         <w:spacing w:after="110" w:before="220"/>
         <w:jc w:val="center"/>
       </w:pPr>
@@ -618,6 +632,76 @@
           <w:szCs w:val="19"/>
         </w:rPr>
         <w:t xml:space="preserve">One detail is worth stating clearly. MULT and JR both have to hold RegWrite low, because neither of them writes a general purpose register. MFHI and MFLO are the opposite case. They are ordinary R type writes to rd, so they keep the normal R type values for RegDst and RegWrite.</w:t>
+      </w:r>
+    </w:p>
+    <w:p>
+      <w:pPr>
+        <w:spacing w:after="80" w:before="140"/>
+        <w:jc w:val="left"/>
+      </w:pPr>
+      <w:r>
+        <w:rPr>
+          <w:i/>
+          <w:iCs/>
+          <w:sz w:val="19"/>
+          <w:szCs w:val="19"/>
+        </w:rPr>
+        <w:t xml:space="preserve">D.  Minimum, maximum and sum</w:t>
+      </w:r>
+    </w:p>
+    <w:p>
+      <w:pPr>
+        <w:spacing w:after="100" w:line="230"/>
+        <w:jc w:val="both"/>
+      </w:pPr>
+      <w:r>
+        <w:rPr>
+          <w:sz w:val="19"/>
+          <w:szCs w:val="19"/>
+        </w:rPr>
+        <w:t xml:space="preserve">These three needed no new control signals whatsoever, which makes them the cheapest additions in the whole project. They are plain three operand R type instructions that read two registers, do something in the ALU, and write the result to rd. That is exactly what the existing R type defaults already describe, so RegDst, RegWrite, ALUSrc and MemtoReg all keep the values they already had. The only thing the control unit does is select the right ALU operation.</w:t>
+      </w:r>
+    </w:p>
+    <w:p>
+      <w:pPr>
+        <w:spacing w:after="100" w:line="230"/>
+        <w:ind w:firstLine="200"/>
+        <w:jc w:val="both"/>
+      </w:pPr>
+      <w:r>
+        <w:rPr>
+          <w:sz w:val="19"/>
+          <w:szCs w:val="19"/>
+        </w:rPr>
+        <w:t xml:space="preserve">The real obstacle was somewhere else entirely. The ALU operation is selected by a field called ALUControl, and that field was four bits wide. Fifteen of its sixteen possible codes were already spoken for, which left exactly one free code, and we needed three. So we widened ALUControl from four bits to five. That change touches four files, because the field runs from the control unit through the datapath and into the ALU.</w:t>
+      </w:r>
+    </w:p>
+    <w:p>
+      <w:pPr>
+        <w:spacing w:after="100" w:line="230"/>
+        <w:ind w:firstLine="200"/>
+        <w:jc w:val="both"/>
+      </w:pPr>
+      <w:r>
+        <w:rPr>
+          <w:sz w:val="19"/>
+          <w:szCs w:val="19"/>
+        </w:rPr>
+        <w:t xml:space="preserve">Widening a field that everything depends on sounds risky, but it was made safe by giving every existing operation its old code with a leading zero added. ADD was 0000 and became 00000, SLT was 1000 and became 01000, and so on for all fifteen. Nothing that previously worked changed meaning. The three new codes then live in the upper half of the widened space, which was entirely empty before. We re ran all three earlier test programs afterwards and every result was identical to what it had been, which is what we would expect if the widening was done correctly.</w:t>
+      </w:r>
+    </w:p>
+    <w:p>
+      <w:pPr>
+        <w:spacing w:after="100" w:line="230"/>
+        <w:ind w:firstLine="200"/>
+        <w:jc w:val="both"/>
+      </w:pPr>
+      <w:r>
+        <w:rPr>
+          <w:sz w:val="19"/>
+          <w:szCs w:val="19"/>
+        </w:rPr>
+        <w:t xml:space="preserve">For the function codes we picked 101100, 101101 and 101110. These are unused in the real MIPS R type encoding space, so the new instructions cannot be confused with any genuine MIPS instruction.</w:t>
       </w:r>
     </w:p>
     <w:p>
@@ -1834,7 +1918,7 @@
                 <w:sz w:val="14"/>
                 <w:szCs w:val="14"/>
               </w:rPr>
-              <w:t xml:space="preserve">0101</w:t>
+              <w:t xml:space="preserve">00101</w:t>
             </w:r>
           </w:p>
         </w:tc>
@@ -2174,7 +2258,7 @@
                 <w:sz w:val="14"/>
                 <w:szCs w:val="14"/>
               </w:rPr>
-              <w:t xml:space="preserve">0110</w:t>
+              <w:t xml:space="preserve">00110</w:t>
             </w:r>
           </w:p>
         </w:tc>
@@ -2527,7 +2611,7 @@
                 <w:sz w:val="14"/>
                 <w:szCs w:val="14"/>
               </w:rPr>
-              <w:t xml:space="preserve">0111</w:t>
+              <w:t xml:space="preserve">00111</w:t>
             </w:r>
           </w:p>
         </w:tc>
@@ -2867,7 +2951,7 @@
                 <w:sz w:val="14"/>
                 <w:szCs w:val="14"/>
               </w:rPr>
-              <w:t xml:space="preserve">1011</w:t>
+              <w:t xml:space="preserve">01011</w:t>
             </w:r>
           </w:p>
         </w:tc>
@@ -3220,7 +3304,7 @@
                 <w:sz w:val="14"/>
                 <w:szCs w:val="14"/>
               </w:rPr>
-              <w:t xml:space="preserve">1100</w:t>
+              <w:t xml:space="preserve">01100</w:t>
             </w:r>
           </w:p>
         </w:tc>
@@ -3560,7 +3644,7 @@
                 <w:sz w:val="14"/>
                 <w:szCs w:val="14"/>
               </w:rPr>
-              <w:t xml:space="preserve">1101</w:t>
+              <w:t xml:space="preserve">01101</w:t>
             </w:r>
           </w:p>
         </w:tc>
@@ -4981,7 +5065,7 @@
         <w:tc>
           <w:tcPr>
             <w:tcW w:type="dxa" w:w="1815"/>
-            <w:shd w:fill="F6F6F6" w:val="clear"/>
+            <w:shd w:fill="DCE7F5" w:val="clear"/>
             <w:tcMar>
               <w:top w:type="dxa" w:w="30"/>
               <w:left w:type="dxa" w:w="40"/>
@@ -5001,7 +5085,1406 @@
                 <w:sz w:val="14"/>
                 <w:szCs w:val="14"/>
               </w:rPr>
+              <w:t xml:space="preserve">min  (added)</w:t>
+            </w:r>
+          </w:p>
+        </w:tc>
+        <w:tc>
+          <w:tcPr>
+            <w:tcW w:type="dxa" w:w="682"/>
+            <w:shd w:fill="DCE7F5" w:val="clear"/>
+            <w:tcMar>
+              <w:top w:type="dxa" w:w="30"/>
+              <w:left w:type="dxa" w:w="40"/>
+              <w:bottom w:type="dxa" w:w="30"/>
+              <w:right w:type="dxa" w:w="40"/>
+            </w:tcMar>
+            <w:vAlign w:val="center"/>
+          </w:tcPr>
+          <w:p>
+            <w:pPr>
+              <w:jc w:val="center"/>
+            </w:pPr>
+            <w:r>
+              <w:rPr>
+                <w:b w:val="false"/>
+                <w:bCs w:val="false"/>
+                <w:sz w:val="14"/>
+                <w:szCs w:val="14"/>
+              </w:rPr>
+              <w:t xml:space="preserve">1</w:t>
+            </w:r>
+          </w:p>
+        </w:tc>
+        <w:tc>
+          <w:tcPr>
+            <w:tcW w:type="dxa" w:w="682"/>
+            <w:shd w:fill="DCE7F5" w:val="clear"/>
+            <w:tcMar>
+              <w:top w:type="dxa" w:w="30"/>
+              <w:left w:type="dxa" w:w="40"/>
+              <w:bottom w:type="dxa" w:w="30"/>
+              <w:right w:type="dxa" w:w="40"/>
+            </w:tcMar>
+            <w:vAlign w:val="center"/>
+          </w:tcPr>
+          <w:p>
+            <w:pPr>
+              <w:jc w:val="center"/>
+            </w:pPr>
+            <w:r>
+              <w:rPr>
+                <w:b w:val="false"/>
+                <w:bCs w:val="false"/>
+                <w:sz w:val="14"/>
+                <w:szCs w:val="14"/>
+              </w:rPr>
+              <w:t xml:space="preserve">0</w:t>
+            </w:r>
+          </w:p>
+        </w:tc>
+        <w:tc>
+          <w:tcPr>
+            <w:tcW w:type="dxa" w:w="770"/>
+            <w:shd w:fill="DCE7F5" w:val="clear"/>
+            <w:tcMar>
+              <w:top w:type="dxa" w:w="30"/>
+              <w:left w:type="dxa" w:w="40"/>
+              <w:bottom w:type="dxa" w:w="30"/>
+              <w:right w:type="dxa" w:w="40"/>
+            </w:tcMar>
+            <w:vAlign w:val="center"/>
+          </w:tcPr>
+          <w:p>
+            <w:pPr>
+              <w:jc w:val="center"/>
+            </w:pPr>
+            <w:r>
+              <w:rPr>
+                <w:b w:val="false"/>
+                <w:bCs w:val="false"/>
+                <w:sz w:val="14"/>
+                <w:szCs w:val="14"/>
+              </w:rPr>
+              <w:t xml:space="preserve">0</w:t>
+            </w:r>
+          </w:p>
+        </w:tc>
+        <w:tc>
+          <w:tcPr>
+            <w:tcW w:type="dxa" w:w="770"/>
+            <w:shd w:fill="DCE7F5" w:val="clear"/>
+            <w:tcMar>
+              <w:top w:type="dxa" w:w="30"/>
+              <w:left w:type="dxa" w:w="40"/>
+              <w:bottom w:type="dxa" w:w="30"/>
+              <w:right w:type="dxa" w:w="40"/>
+            </w:tcMar>
+            <w:vAlign w:val="center"/>
+          </w:tcPr>
+          <w:p>
+            <w:pPr>
+              <w:jc w:val="center"/>
+            </w:pPr>
+            <w:r>
+              <w:rPr>
+                <w:b w:val="false"/>
+                <w:bCs w:val="false"/>
+                <w:sz w:val="14"/>
+                <w:szCs w:val="14"/>
+              </w:rPr>
+              <w:t xml:space="preserve">1</w:t>
+            </w:r>
+          </w:p>
+        </w:tc>
+        <w:tc>
+          <w:tcPr>
+            <w:tcW w:type="dxa" w:w="770"/>
+            <w:shd w:fill="DCE7F5" w:val="clear"/>
+            <w:tcMar>
+              <w:top w:type="dxa" w:w="30"/>
+              <w:left w:type="dxa" w:w="40"/>
+              <w:bottom w:type="dxa" w:w="30"/>
+              <w:right w:type="dxa" w:w="40"/>
+            </w:tcMar>
+            <w:vAlign w:val="center"/>
+          </w:tcPr>
+          <w:p>
+            <w:pPr>
+              <w:jc w:val="center"/>
+            </w:pPr>
+            <w:r>
+              <w:rPr>
+                <w:b w:val="false"/>
+                <w:bCs w:val="false"/>
+                <w:sz w:val="14"/>
+                <w:szCs w:val="14"/>
+              </w:rPr>
+              <w:t xml:space="preserve">0</w:t>
+            </w:r>
+          </w:p>
+        </w:tc>
+        <w:tc>
+          <w:tcPr>
+            <w:tcW w:type="dxa" w:w="770"/>
+            <w:shd w:fill="DCE7F5" w:val="clear"/>
+            <w:tcMar>
+              <w:top w:type="dxa" w:w="30"/>
+              <w:left w:type="dxa" w:w="40"/>
+              <w:bottom w:type="dxa" w:w="30"/>
+              <w:right w:type="dxa" w:w="40"/>
+            </w:tcMar>
+            <w:vAlign w:val="center"/>
+          </w:tcPr>
+          <w:p>
+            <w:pPr>
+              <w:jc w:val="center"/>
+            </w:pPr>
+            <w:r>
+              <w:rPr>
+                <w:b w:val="false"/>
+                <w:bCs w:val="false"/>
+                <w:sz w:val="14"/>
+                <w:szCs w:val="14"/>
+              </w:rPr>
+              <w:t xml:space="preserve">0, 0</w:t>
+            </w:r>
+          </w:p>
+        </w:tc>
+        <w:tc>
+          <w:tcPr>
+            <w:tcW w:type="dxa" w:w="616"/>
+            <w:shd w:fill="DCE7F5" w:val="clear"/>
+            <w:tcMar>
+              <w:top w:type="dxa" w:w="30"/>
+              <w:left w:type="dxa" w:w="40"/>
+              <w:bottom w:type="dxa" w:w="30"/>
+              <w:right w:type="dxa" w:w="40"/>
+            </w:tcMar>
+            <w:vAlign w:val="center"/>
+          </w:tcPr>
+          <w:p>
+            <w:pPr>
+              <w:jc w:val="center"/>
+            </w:pPr>
+            <w:r>
+              <w:rPr>
+                <w:b w:val="false"/>
+                <w:bCs w:val="false"/>
+                <w:sz w:val="14"/>
+                <w:szCs w:val="14"/>
+              </w:rPr>
+              <w:t xml:space="preserve">0</w:t>
+            </w:r>
+          </w:p>
+        </w:tc>
+        <w:tc>
+          <w:tcPr>
+            <w:tcW w:type="dxa" w:w="572"/>
+            <w:shd w:fill="DCE7F5" w:val="clear"/>
+            <w:tcMar>
+              <w:top w:type="dxa" w:w="30"/>
+              <w:left w:type="dxa" w:w="40"/>
+              <w:bottom w:type="dxa" w:w="30"/>
+              <w:right w:type="dxa" w:w="40"/>
+            </w:tcMar>
+            <w:vAlign w:val="center"/>
+          </w:tcPr>
+          <w:p>
+            <w:pPr>
+              <w:jc w:val="center"/>
+            </w:pPr>
+            <w:r>
+              <w:rPr>
+                <w:b w:val="false"/>
+                <w:bCs w:val="false"/>
+                <w:sz w:val="14"/>
+                <w:szCs w:val="14"/>
+              </w:rPr>
+              <w:t xml:space="preserve">0</w:t>
+            </w:r>
+          </w:p>
+        </w:tc>
+        <w:tc>
+          <w:tcPr>
+            <w:tcW w:type="dxa" w:w="528"/>
+            <w:shd w:fill="DCE7F5" w:val="clear"/>
+            <w:tcMar>
+              <w:top w:type="dxa" w:w="30"/>
+              <w:left w:type="dxa" w:w="40"/>
+              <w:bottom w:type="dxa" w:w="30"/>
+              <w:right w:type="dxa" w:w="40"/>
+            </w:tcMar>
+            <w:vAlign w:val="center"/>
+          </w:tcPr>
+          <w:p>
+            <w:pPr>
+              <w:jc w:val="center"/>
+            </w:pPr>
+            <w:r>
+              <w:rPr>
+                <w:b w:val="false"/>
+                <w:bCs w:val="false"/>
+                <w:sz w:val="14"/>
+                <w:szCs w:val="14"/>
+              </w:rPr>
+              <w:t xml:space="preserve">0</w:t>
+            </w:r>
+          </w:p>
+        </w:tc>
+        <w:tc>
+          <w:tcPr>
+            <w:tcW w:type="dxa" w:w="726"/>
+            <w:shd w:fill="DCE7F5" w:val="clear"/>
+            <w:tcMar>
+              <w:top w:type="dxa" w:w="30"/>
+              <w:left w:type="dxa" w:w="40"/>
+              <w:bottom w:type="dxa" w:w="30"/>
+              <w:right w:type="dxa" w:w="40"/>
+            </w:tcMar>
+            <w:vAlign w:val="center"/>
+          </w:tcPr>
+          <w:p>
+            <w:pPr>
+              <w:jc w:val="center"/>
+            </w:pPr>
+            <w:r>
+              <w:rPr>
+                <w:b w:val="false"/>
+                <w:bCs w:val="false"/>
+                <w:sz w:val="14"/>
+                <w:szCs w:val="14"/>
+              </w:rPr>
+              <w:t xml:space="preserve">0</w:t>
+            </w:r>
+          </w:p>
+        </w:tc>
+        <w:tc>
+          <w:tcPr>
+            <w:tcW w:type="dxa" w:w="748"/>
+            <w:shd w:fill="DCE7F5" w:val="clear"/>
+            <w:tcMar>
+              <w:top w:type="dxa" w:w="30"/>
+              <w:left w:type="dxa" w:w="40"/>
+              <w:bottom w:type="dxa" w:w="30"/>
+              <w:right w:type="dxa" w:w="40"/>
+            </w:tcMar>
+            <w:vAlign w:val="center"/>
+          </w:tcPr>
+          <w:p>
+            <w:pPr>
+              <w:jc w:val="center"/>
+            </w:pPr>
+            <w:r>
+              <w:rPr>
+                <w:b w:val="false"/>
+                <w:bCs w:val="false"/>
+                <w:sz w:val="14"/>
+                <w:szCs w:val="14"/>
+              </w:rPr>
+              <w:t xml:space="preserve">0</w:t>
+            </w:r>
+          </w:p>
+        </w:tc>
+        <w:tc>
+          <w:tcPr>
+            <w:tcW w:type="dxa" w:w="770"/>
+            <w:shd w:fill="DCE7F5" w:val="clear"/>
+            <w:tcMar>
+              <w:top w:type="dxa" w:w="30"/>
+              <w:left w:type="dxa" w:w="40"/>
+              <w:bottom w:type="dxa" w:w="30"/>
+              <w:right w:type="dxa" w:w="40"/>
+            </w:tcMar>
+            <w:vAlign w:val="center"/>
+          </w:tcPr>
+          <w:p>
+            <w:pPr>
+              <w:jc w:val="center"/>
+            </w:pPr>
+            <w:r>
+              <w:rPr>
+                <w:b w:val="false"/>
+                <w:bCs w:val="false"/>
+                <w:sz w:val="14"/>
+                <w:szCs w:val="14"/>
+              </w:rPr>
+              <w:t xml:space="preserve">10000</w:t>
+            </w:r>
+          </w:p>
+        </w:tc>
+      </w:tr>
+      <w:tr>
+        <w:tc>
+          <w:tcPr>
+            <w:tcW w:type="dxa" w:w="1815"/>
+            <w:shd w:fill="DCE7F5" w:val="clear"/>
+            <w:tcMar>
+              <w:top w:type="dxa" w:w="30"/>
+              <w:left w:type="dxa" w:w="40"/>
+              <w:bottom w:type="dxa" w:w="30"/>
+              <w:right w:type="dxa" w:w="40"/>
+            </w:tcMar>
+            <w:vAlign w:val="center"/>
+          </w:tcPr>
+          <w:p>
+            <w:pPr>
+              <w:jc w:val="left"/>
+            </w:pPr>
+            <w:r>
+              <w:rPr>
+                <w:b/>
+                <w:bCs/>
+                <w:sz w:val="14"/>
+                <w:szCs w:val="14"/>
+              </w:rPr>
+              <w:t xml:space="preserve">max  (added)</w:t>
+            </w:r>
+          </w:p>
+        </w:tc>
+        <w:tc>
+          <w:tcPr>
+            <w:tcW w:type="dxa" w:w="682"/>
+            <w:shd w:fill="DCE7F5" w:val="clear"/>
+            <w:tcMar>
+              <w:top w:type="dxa" w:w="30"/>
+              <w:left w:type="dxa" w:w="40"/>
+              <w:bottom w:type="dxa" w:w="30"/>
+              <w:right w:type="dxa" w:w="40"/>
+            </w:tcMar>
+            <w:vAlign w:val="center"/>
+          </w:tcPr>
+          <w:p>
+            <w:pPr>
+              <w:jc w:val="center"/>
+            </w:pPr>
+            <w:r>
+              <w:rPr>
+                <w:b w:val="false"/>
+                <w:bCs w:val="false"/>
+                <w:sz w:val="14"/>
+                <w:szCs w:val="14"/>
+              </w:rPr>
+              <w:t xml:space="preserve">1</w:t>
+            </w:r>
+          </w:p>
+        </w:tc>
+        <w:tc>
+          <w:tcPr>
+            <w:tcW w:type="dxa" w:w="682"/>
+            <w:shd w:fill="DCE7F5" w:val="clear"/>
+            <w:tcMar>
+              <w:top w:type="dxa" w:w="30"/>
+              <w:left w:type="dxa" w:w="40"/>
+              <w:bottom w:type="dxa" w:w="30"/>
+              <w:right w:type="dxa" w:w="40"/>
+            </w:tcMar>
+            <w:vAlign w:val="center"/>
+          </w:tcPr>
+          <w:p>
+            <w:pPr>
+              <w:jc w:val="center"/>
+            </w:pPr>
+            <w:r>
+              <w:rPr>
+                <w:b w:val="false"/>
+                <w:bCs w:val="false"/>
+                <w:sz w:val="14"/>
+                <w:szCs w:val="14"/>
+              </w:rPr>
+              <w:t xml:space="preserve">0</w:t>
+            </w:r>
+          </w:p>
+        </w:tc>
+        <w:tc>
+          <w:tcPr>
+            <w:tcW w:type="dxa" w:w="770"/>
+            <w:shd w:fill="DCE7F5" w:val="clear"/>
+            <w:tcMar>
+              <w:top w:type="dxa" w:w="30"/>
+              <w:left w:type="dxa" w:w="40"/>
+              <w:bottom w:type="dxa" w:w="30"/>
+              <w:right w:type="dxa" w:w="40"/>
+            </w:tcMar>
+            <w:vAlign w:val="center"/>
+          </w:tcPr>
+          <w:p>
+            <w:pPr>
+              <w:jc w:val="center"/>
+            </w:pPr>
+            <w:r>
+              <w:rPr>
+                <w:b w:val="false"/>
+                <w:bCs w:val="false"/>
+                <w:sz w:val="14"/>
+                <w:szCs w:val="14"/>
+              </w:rPr>
+              <w:t xml:space="preserve">0</w:t>
+            </w:r>
+          </w:p>
+        </w:tc>
+        <w:tc>
+          <w:tcPr>
+            <w:tcW w:type="dxa" w:w="770"/>
+            <w:shd w:fill="DCE7F5" w:val="clear"/>
+            <w:tcMar>
+              <w:top w:type="dxa" w:w="30"/>
+              <w:left w:type="dxa" w:w="40"/>
+              <w:bottom w:type="dxa" w:w="30"/>
+              <w:right w:type="dxa" w:w="40"/>
+            </w:tcMar>
+            <w:vAlign w:val="center"/>
+          </w:tcPr>
+          <w:p>
+            <w:pPr>
+              <w:jc w:val="center"/>
+            </w:pPr>
+            <w:r>
+              <w:rPr>
+                <w:b w:val="false"/>
+                <w:bCs w:val="false"/>
+                <w:sz w:val="14"/>
+                <w:szCs w:val="14"/>
+              </w:rPr>
+              <w:t xml:space="preserve">1</w:t>
+            </w:r>
+          </w:p>
+        </w:tc>
+        <w:tc>
+          <w:tcPr>
+            <w:tcW w:type="dxa" w:w="770"/>
+            <w:shd w:fill="DCE7F5" w:val="clear"/>
+            <w:tcMar>
+              <w:top w:type="dxa" w:w="30"/>
+              <w:left w:type="dxa" w:w="40"/>
+              <w:bottom w:type="dxa" w:w="30"/>
+              <w:right w:type="dxa" w:w="40"/>
+            </w:tcMar>
+            <w:vAlign w:val="center"/>
+          </w:tcPr>
+          <w:p>
+            <w:pPr>
+              <w:jc w:val="center"/>
+            </w:pPr>
+            <w:r>
+              <w:rPr>
+                <w:b w:val="false"/>
+                <w:bCs w:val="false"/>
+                <w:sz w:val="14"/>
+                <w:szCs w:val="14"/>
+              </w:rPr>
+              <w:t xml:space="preserve">0</w:t>
+            </w:r>
+          </w:p>
+        </w:tc>
+        <w:tc>
+          <w:tcPr>
+            <w:tcW w:type="dxa" w:w="770"/>
+            <w:shd w:fill="DCE7F5" w:val="clear"/>
+            <w:tcMar>
+              <w:top w:type="dxa" w:w="30"/>
+              <w:left w:type="dxa" w:w="40"/>
+              <w:bottom w:type="dxa" w:w="30"/>
+              <w:right w:type="dxa" w:w="40"/>
+            </w:tcMar>
+            <w:vAlign w:val="center"/>
+          </w:tcPr>
+          <w:p>
+            <w:pPr>
+              <w:jc w:val="center"/>
+            </w:pPr>
+            <w:r>
+              <w:rPr>
+                <w:b w:val="false"/>
+                <w:bCs w:val="false"/>
+                <w:sz w:val="14"/>
+                <w:szCs w:val="14"/>
+              </w:rPr>
+              <w:t xml:space="preserve">0, 0</w:t>
+            </w:r>
+          </w:p>
+        </w:tc>
+        <w:tc>
+          <w:tcPr>
+            <w:tcW w:type="dxa" w:w="616"/>
+            <w:shd w:fill="DCE7F5" w:val="clear"/>
+            <w:tcMar>
+              <w:top w:type="dxa" w:w="30"/>
+              <w:left w:type="dxa" w:w="40"/>
+              <w:bottom w:type="dxa" w:w="30"/>
+              <w:right w:type="dxa" w:w="40"/>
+            </w:tcMar>
+            <w:vAlign w:val="center"/>
+          </w:tcPr>
+          <w:p>
+            <w:pPr>
+              <w:jc w:val="center"/>
+            </w:pPr>
+            <w:r>
+              <w:rPr>
+                <w:b w:val="false"/>
+                <w:bCs w:val="false"/>
+                <w:sz w:val="14"/>
+                <w:szCs w:val="14"/>
+              </w:rPr>
+              <w:t xml:space="preserve">0</w:t>
+            </w:r>
+          </w:p>
+        </w:tc>
+        <w:tc>
+          <w:tcPr>
+            <w:tcW w:type="dxa" w:w="572"/>
+            <w:shd w:fill="DCE7F5" w:val="clear"/>
+            <w:tcMar>
+              <w:top w:type="dxa" w:w="30"/>
+              <w:left w:type="dxa" w:w="40"/>
+              <w:bottom w:type="dxa" w:w="30"/>
+              <w:right w:type="dxa" w:w="40"/>
+            </w:tcMar>
+            <w:vAlign w:val="center"/>
+          </w:tcPr>
+          <w:p>
+            <w:pPr>
+              <w:jc w:val="center"/>
+            </w:pPr>
+            <w:r>
+              <w:rPr>
+                <w:b w:val="false"/>
+                <w:bCs w:val="false"/>
+                <w:sz w:val="14"/>
+                <w:szCs w:val="14"/>
+              </w:rPr>
+              <w:t xml:space="preserve">0</w:t>
+            </w:r>
+          </w:p>
+        </w:tc>
+        <w:tc>
+          <w:tcPr>
+            <w:tcW w:type="dxa" w:w="528"/>
+            <w:shd w:fill="DCE7F5" w:val="clear"/>
+            <w:tcMar>
+              <w:top w:type="dxa" w:w="30"/>
+              <w:left w:type="dxa" w:w="40"/>
+              <w:bottom w:type="dxa" w:w="30"/>
+              <w:right w:type="dxa" w:w="40"/>
+            </w:tcMar>
+            <w:vAlign w:val="center"/>
+          </w:tcPr>
+          <w:p>
+            <w:pPr>
+              <w:jc w:val="center"/>
+            </w:pPr>
+            <w:r>
+              <w:rPr>
+                <w:b w:val="false"/>
+                <w:bCs w:val="false"/>
+                <w:sz w:val="14"/>
+                <w:szCs w:val="14"/>
+              </w:rPr>
+              <w:t xml:space="preserve">0</w:t>
+            </w:r>
+          </w:p>
+        </w:tc>
+        <w:tc>
+          <w:tcPr>
+            <w:tcW w:type="dxa" w:w="726"/>
+            <w:shd w:fill="DCE7F5" w:val="clear"/>
+            <w:tcMar>
+              <w:top w:type="dxa" w:w="30"/>
+              <w:left w:type="dxa" w:w="40"/>
+              <w:bottom w:type="dxa" w:w="30"/>
+              <w:right w:type="dxa" w:w="40"/>
+            </w:tcMar>
+            <w:vAlign w:val="center"/>
+          </w:tcPr>
+          <w:p>
+            <w:pPr>
+              <w:jc w:val="center"/>
+            </w:pPr>
+            <w:r>
+              <w:rPr>
+                <w:b w:val="false"/>
+                <w:bCs w:val="false"/>
+                <w:sz w:val="14"/>
+                <w:szCs w:val="14"/>
+              </w:rPr>
+              <w:t xml:space="preserve">0</w:t>
+            </w:r>
+          </w:p>
+        </w:tc>
+        <w:tc>
+          <w:tcPr>
+            <w:tcW w:type="dxa" w:w="748"/>
+            <w:shd w:fill="DCE7F5" w:val="clear"/>
+            <w:tcMar>
+              <w:top w:type="dxa" w:w="30"/>
+              <w:left w:type="dxa" w:w="40"/>
+              <w:bottom w:type="dxa" w:w="30"/>
+              <w:right w:type="dxa" w:w="40"/>
+            </w:tcMar>
+            <w:vAlign w:val="center"/>
+          </w:tcPr>
+          <w:p>
+            <w:pPr>
+              <w:jc w:val="center"/>
+            </w:pPr>
+            <w:r>
+              <w:rPr>
+                <w:b w:val="false"/>
+                <w:bCs w:val="false"/>
+                <w:sz w:val="14"/>
+                <w:szCs w:val="14"/>
+              </w:rPr>
+              <w:t xml:space="preserve">0</w:t>
+            </w:r>
+          </w:p>
+        </w:tc>
+        <w:tc>
+          <w:tcPr>
+            <w:tcW w:type="dxa" w:w="770"/>
+            <w:shd w:fill="DCE7F5" w:val="clear"/>
+            <w:tcMar>
+              <w:top w:type="dxa" w:w="30"/>
+              <w:left w:type="dxa" w:w="40"/>
+              <w:bottom w:type="dxa" w:w="30"/>
+              <w:right w:type="dxa" w:w="40"/>
+            </w:tcMar>
+            <w:vAlign w:val="center"/>
+          </w:tcPr>
+          <w:p>
+            <w:pPr>
+              <w:jc w:val="center"/>
+            </w:pPr>
+            <w:r>
+              <w:rPr>
+                <w:b w:val="false"/>
+                <w:bCs w:val="false"/>
+                <w:sz w:val="14"/>
+                <w:szCs w:val="14"/>
+              </w:rPr>
+              <w:t xml:space="preserve">10001</w:t>
+            </w:r>
+          </w:p>
+        </w:tc>
+      </w:tr>
+      <w:tr>
+        <w:tc>
+          <w:tcPr>
+            <w:tcW w:type="dxa" w:w="1815"/>
+            <w:shd w:fill="DCE7F5" w:val="clear"/>
+            <w:tcMar>
+              <w:top w:type="dxa" w:w="30"/>
+              <w:left w:type="dxa" w:w="40"/>
+              <w:bottom w:type="dxa" w:w="30"/>
+              <w:right w:type="dxa" w:w="40"/>
+            </w:tcMar>
+            <w:vAlign w:val="center"/>
+          </w:tcPr>
+          <w:p>
+            <w:pPr>
+              <w:jc w:val="left"/>
+            </w:pPr>
+            <w:r>
+              <w:rPr>
+                <w:b/>
+                <w:bCs/>
+                <w:sz w:val="14"/>
+                <w:szCs w:val="14"/>
+              </w:rPr>
+              <w:t xml:space="preserve">sum  (added)</w:t>
+            </w:r>
+          </w:p>
+        </w:tc>
+        <w:tc>
+          <w:tcPr>
+            <w:tcW w:type="dxa" w:w="682"/>
+            <w:shd w:fill="DCE7F5" w:val="clear"/>
+            <w:tcMar>
+              <w:top w:type="dxa" w:w="30"/>
+              <w:left w:type="dxa" w:w="40"/>
+              <w:bottom w:type="dxa" w:w="30"/>
+              <w:right w:type="dxa" w:w="40"/>
+            </w:tcMar>
+            <w:vAlign w:val="center"/>
+          </w:tcPr>
+          <w:p>
+            <w:pPr>
+              <w:jc w:val="center"/>
+            </w:pPr>
+            <w:r>
+              <w:rPr>
+                <w:b w:val="false"/>
+                <w:bCs w:val="false"/>
+                <w:sz w:val="14"/>
+                <w:szCs w:val="14"/>
+              </w:rPr>
+              <w:t xml:space="preserve">1</w:t>
+            </w:r>
+          </w:p>
+        </w:tc>
+        <w:tc>
+          <w:tcPr>
+            <w:tcW w:type="dxa" w:w="682"/>
+            <w:shd w:fill="DCE7F5" w:val="clear"/>
+            <w:tcMar>
+              <w:top w:type="dxa" w:w="30"/>
+              <w:left w:type="dxa" w:w="40"/>
+              <w:bottom w:type="dxa" w:w="30"/>
+              <w:right w:type="dxa" w:w="40"/>
+            </w:tcMar>
+            <w:vAlign w:val="center"/>
+          </w:tcPr>
+          <w:p>
+            <w:pPr>
+              <w:jc w:val="center"/>
+            </w:pPr>
+            <w:r>
+              <w:rPr>
+                <w:b w:val="false"/>
+                <w:bCs w:val="false"/>
+                <w:sz w:val="14"/>
+                <w:szCs w:val="14"/>
+              </w:rPr>
+              <w:t xml:space="preserve">0</w:t>
+            </w:r>
+          </w:p>
+        </w:tc>
+        <w:tc>
+          <w:tcPr>
+            <w:tcW w:type="dxa" w:w="770"/>
+            <w:shd w:fill="DCE7F5" w:val="clear"/>
+            <w:tcMar>
+              <w:top w:type="dxa" w:w="30"/>
+              <w:left w:type="dxa" w:w="40"/>
+              <w:bottom w:type="dxa" w:w="30"/>
+              <w:right w:type="dxa" w:w="40"/>
+            </w:tcMar>
+            <w:vAlign w:val="center"/>
+          </w:tcPr>
+          <w:p>
+            <w:pPr>
+              <w:jc w:val="center"/>
+            </w:pPr>
+            <w:r>
+              <w:rPr>
+                <w:b w:val="false"/>
+                <w:bCs w:val="false"/>
+                <w:sz w:val="14"/>
+                <w:szCs w:val="14"/>
+              </w:rPr>
+              <w:t xml:space="preserve">0</w:t>
+            </w:r>
+          </w:p>
+        </w:tc>
+        <w:tc>
+          <w:tcPr>
+            <w:tcW w:type="dxa" w:w="770"/>
+            <w:shd w:fill="DCE7F5" w:val="clear"/>
+            <w:tcMar>
+              <w:top w:type="dxa" w:w="30"/>
+              <w:left w:type="dxa" w:w="40"/>
+              <w:bottom w:type="dxa" w:w="30"/>
+              <w:right w:type="dxa" w:w="40"/>
+            </w:tcMar>
+            <w:vAlign w:val="center"/>
+          </w:tcPr>
+          <w:p>
+            <w:pPr>
+              <w:jc w:val="center"/>
+            </w:pPr>
+            <w:r>
+              <w:rPr>
+                <w:b w:val="false"/>
+                <w:bCs w:val="false"/>
+                <w:sz w:val="14"/>
+                <w:szCs w:val="14"/>
+              </w:rPr>
+              <w:t xml:space="preserve">1</w:t>
+            </w:r>
+          </w:p>
+        </w:tc>
+        <w:tc>
+          <w:tcPr>
+            <w:tcW w:type="dxa" w:w="770"/>
+            <w:shd w:fill="DCE7F5" w:val="clear"/>
+            <w:tcMar>
+              <w:top w:type="dxa" w:w="30"/>
+              <w:left w:type="dxa" w:w="40"/>
+              <w:bottom w:type="dxa" w:w="30"/>
+              <w:right w:type="dxa" w:w="40"/>
+            </w:tcMar>
+            <w:vAlign w:val="center"/>
+          </w:tcPr>
+          <w:p>
+            <w:pPr>
+              <w:jc w:val="center"/>
+            </w:pPr>
+            <w:r>
+              <w:rPr>
+                <w:b w:val="false"/>
+                <w:bCs w:val="false"/>
+                <w:sz w:val="14"/>
+                <w:szCs w:val="14"/>
+              </w:rPr>
+              <w:t xml:space="preserve">0</w:t>
+            </w:r>
+          </w:p>
+        </w:tc>
+        <w:tc>
+          <w:tcPr>
+            <w:tcW w:type="dxa" w:w="770"/>
+            <w:shd w:fill="DCE7F5" w:val="clear"/>
+            <w:tcMar>
+              <w:top w:type="dxa" w:w="30"/>
+              <w:left w:type="dxa" w:w="40"/>
+              <w:bottom w:type="dxa" w:w="30"/>
+              <w:right w:type="dxa" w:w="40"/>
+            </w:tcMar>
+            <w:vAlign w:val="center"/>
+          </w:tcPr>
+          <w:p>
+            <w:pPr>
+              <w:jc w:val="center"/>
+            </w:pPr>
+            <w:r>
+              <w:rPr>
+                <w:b w:val="false"/>
+                <w:bCs w:val="false"/>
+                <w:sz w:val="14"/>
+                <w:szCs w:val="14"/>
+              </w:rPr>
+              <w:t xml:space="preserve">0, 0</w:t>
+            </w:r>
+          </w:p>
+        </w:tc>
+        <w:tc>
+          <w:tcPr>
+            <w:tcW w:type="dxa" w:w="616"/>
+            <w:shd w:fill="DCE7F5" w:val="clear"/>
+            <w:tcMar>
+              <w:top w:type="dxa" w:w="30"/>
+              <w:left w:type="dxa" w:w="40"/>
+              <w:bottom w:type="dxa" w:w="30"/>
+              <w:right w:type="dxa" w:w="40"/>
+            </w:tcMar>
+            <w:vAlign w:val="center"/>
+          </w:tcPr>
+          <w:p>
+            <w:pPr>
+              <w:jc w:val="center"/>
+            </w:pPr>
+            <w:r>
+              <w:rPr>
+                <w:b w:val="false"/>
+                <w:bCs w:val="false"/>
+                <w:sz w:val="14"/>
+                <w:szCs w:val="14"/>
+              </w:rPr>
+              <w:t xml:space="preserve">0</w:t>
+            </w:r>
+          </w:p>
+        </w:tc>
+        <w:tc>
+          <w:tcPr>
+            <w:tcW w:type="dxa" w:w="572"/>
+            <w:shd w:fill="DCE7F5" w:val="clear"/>
+            <w:tcMar>
+              <w:top w:type="dxa" w:w="30"/>
+              <w:left w:type="dxa" w:w="40"/>
+              <w:bottom w:type="dxa" w:w="30"/>
+              <w:right w:type="dxa" w:w="40"/>
+            </w:tcMar>
+            <w:vAlign w:val="center"/>
+          </w:tcPr>
+          <w:p>
+            <w:pPr>
+              <w:jc w:val="center"/>
+            </w:pPr>
+            <w:r>
+              <w:rPr>
+                <w:b w:val="false"/>
+                <w:bCs w:val="false"/>
+                <w:sz w:val="14"/>
+                <w:szCs w:val="14"/>
+              </w:rPr>
+              <w:t xml:space="preserve">0</w:t>
+            </w:r>
+          </w:p>
+        </w:tc>
+        <w:tc>
+          <w:tcPr>
+            <w:tcW w:type="dxa" w:w="528"/>
+            <w:shd w:fill="DCE7F5" w:val="clear"/>
+            <w:tcMar>
+              <w:top w:type="dxa" w:w="30"/>
+              <w:left w:type="dxa" w:w="40"/>
+              <w:bottom w:type="dxa" w:w="30"/>
+              <w:right w:type="dxa" w:w="40"/>
+            </w:tcMar>
+            <w:vAlign w:val="center"/>
+          </w:tcPr>
+          <w:p>
+            <w:pPr>
+              <w:jc w:val="center"/>
+            </w:pPr>
+            <w:r>
+              <w:rPr>
+                <w:b w:val="false"/>
+                <w:bCs w:val="false"/>
+                <w:sz w:val="14"/>
+                <w:szCs w:val="14"/>
+              </w:rPr>
+              <w:t xml:space="preserve">0</w:t>
+            </w:r>
+          </w:p>
+        </w:tc>
+        <w:tc>
+          <w:tcPr>
+            <w:tcW w:type="dxa" w:w="726"/>
+            <w:shd w:fill="DCE7F5" w:val="clear"/>
+            <w:tcMar>
+              <w:top w:type="dxa" w:w="30"/>
+              <w:left w:type="dxa" w:w="40"/>
+              <w:bottom w:type="dxa" w:w="30"/>
+              <w:right w:type="dxa" w:w="40"/>
+            </w:tcMar>
+            <w:vAlign w:val="center"/>
+          </w:tcPr>
+          <w:p>
+            <w:pPr>
+              <w:jc w:val="center"/>
+            </w:pPr>
+            <w:r>
+              <w:rPr>
+                <w:b w:val="false"/>
+                <w:bCs w:val="false"/>
+                <w:sz w:val="14"/>
+                <w:szCs w:val="14"/>
+              </w:rPr>
+              <w:t xml:space="preserve">0</w:t>
+            </w:r>
+          </w:p>
+        </w:tc>
+        <w:tc>
+          <w:tcPr>
+            <w:tcW w:type="dxa" w:w="748"/>
+            <w:shd w:fill="DCE7F5" w:val="clear"/>
+            <w:tcMar>
+              <w:top w:type="dxa" w:w="30"/>
+              <w:left w:type="dxa" w:w="40"/>
+              <w:bottom w:type="dxa" w:w="30"/>
+              <w:right w:type="dxa" w:w="40"/>
+            </w:tcMar>
+            <w:vAlign w:val="center"/>
+          </w:tcPr>
+          <w:p>
+            <w:pPr>
+              <w:jc w:val="center"/>
+            </w:pPr>
+            <w:r>
+              <w:rPr>
+                <w:b w:val="false"/>
+                <w:bCs w:val="false"/>
+                <w:sz w:val="14"/>
+                <w:szCs w:val="14"/>
+              </w:rPr>
+              <w:t xml:space="preserve">0</w:t>
+            </w:r>
+          </w:p>
+        </w:tc>
+        <w:tc>
+          <w:tcPr>
+            <w:tcW w:type="dxa" w:w="770"/>
+            <w:shd w:fill="DCE7F5" w:val="clear"/>
+            <w:tcMar>
+              <w:top w:type="dxa" w:w="30"/>
+              <w:left w:type="dxa" w:w="40"/>
+              <w:bottom w:type="dxa" w:w="30"/>
+              <w:right w:type="dxa" w:w="40"/>
+            </w:tcMar>
+            <w:vAlign w:val="center"/>
+          </w:tcPr>
+          <w:p>
+            <w:pPr>
+              <w:jc w:val="center"/>
+            </w:pPr>
+            <w:r>
+              <w:rPr>
+                <w:b w:val="false"/>
+                <w:bCs w:val="false"/>
+                <w:sz w:val="14"/>
+                <w:szCs w:val="14"/>
+              </w:rPr>
+              <w:t xml:space="preserve">10010</w:t>
+            </w:r>
+          </w:p>
+        </w:tc>
+      </w:tr>
+      <w:tr>
+        <w:tc>
+          <w:tcPr>
+            <w:tcW w:type="dxa" w:w="1815"/>
+            <w:tcMar>
+              <w:top w:type="dxa" w:w="30"/>
+              <w:left w:type="dxa" w:w="40"/>
+              <w:bottom w:type="dxa" w:w="30"/>
+              <w:right w:type="dxa" w:w="40"/>
+            </w:tcMar>
+            <w:vAlign w:val="center"/>
+          </w:tcPr>
+          <w:p>
+            <w:pPr>
+              <w:jc w:val="left"/>
+            </w:pPr>
+            <w:r>
+              <w:rPr>
+                <w:b/>
+                <w:bCs/>
+                <w:sz w:val="14"/>
+                <w:szCs w:val="14"/>
+              </w:rPr>
               <w:t xml:space="preserve">lw</w:t>
+            </w:r>
+          </w:p>
+        </w:tc>
+        <w:tc>
+          <w:tcPr>
+            <w:tcW w:type="dxa" w:w="682"/>
+            <w:tcMar>
+              <w:top w:type="dxa" w:w="30"/>
+              <w:left w:type="dxa" w:w="40"/>
+              <w:bottom w:type="dxa" w:w="30"/>
+              <w:right w:type="dxa" w:w="40"/>
+            </w:tcMar>
+            <w:vAlign w:val="center"/>
+          </w:tcPr>
+          <w:p>
+            <w:pPr>
+              <w:jc w:val="center"/>
+            </w:pPr>
+            <w:r>
+              <w:rPr>
+                <w:b w:val="false"/>
+                <w:bCs w:val="false"/>
+                <w:sz w:val="14"/>
+                <w:szCs w:val="14"/>
+              </w:rPr>
+              <w:t xml:space="preserve">0</w:t>
+            </w:r>
+          </w:p>
+        </w:tc>
+        <w:tc>
+          <w:tcPr>
+            <w:tcW w:type="dxa" w:w="682"/>
+            <w:tcMar>
+              <w:top w:type="dxa" w:w="30"/>
+              <w:left w:type="dxa" w:w="40"/>
+              <w:bottom w:type="dxa" w:w="30"/>
+              <w:right w:type="dxa" w:w="40"/>
+            </w:tcMar>
+            <w:vAlign w:val="center"/>
+          </w:tcPr>
+          <w:p>
+            <w:pPr>
+              <w:jc w:val="center"/>
+            </w:pPr>
+            <w:r>
+              <w:rPr>
+                <w:b w:val="false"/>
+                <w:bCs w:val="false"/>
+                <w:sz w:val="14"/>
+                <w:szCs w:val="14"/>
+              </w:rPr>
+              <w:t xml:space="preserve">1</w:t>
+            </w:r>
+          </w:p>
+        </w:tc>
+        <w:tc>
+          <w:tcPr>
+            <w:tcW w:type="dxa" w:w="770"/>
+            <w:tcMar>
+              <w:top w:type="dxa" w:w="30"/>
+              <w:left w:type="dxa" w:w="40"/>
+              <w:bottom w:type="dxa" w:w="30"/>
+              <w:right w:type="dxa" w:w="40"/>
+            </w:tcMar>
+            <w:vAlign w:val="center"/>
+          </w:tcPr>
+          <w:p>
+            <w:pPr>
+              <w:jc w:val="center"/>
+            </w:pPr>
+            <w:r>
+              <w:rPr>
+                <w:b w:val="false"/>
+                <w:bCs w:val="false"/>
+                <w:sz w:val="14"/>
+                <w:szCs w:val="14"/>
+              </w:rPr>
+              <w:t xml:space="preserve">1</w:t>
+            </w:r>
+          </w:p>
+        </w:tc>
+        <w:tc>
+          <w:tcPr>
+            <w:tcW w:type="dxa" w:w="770"/>
+            <w:tcMar>
+              <w:top w:type="dxa" w:w="30"/>
+              <w:left w:type="dxa" w:w="40"/>
+              <w:bottom w:type="dxa" w:w="30"/>
+              <w:right w:type="dxa" w:w="40"/>
+            </w:tcMar>
+            <w:vAlign w:val="center"/>
+          </w:tcPr>
+          <w:p>
+            <w:pPr>
+              <w:jc w:val="center"/>
+            </w:pPr>
+            <w:r>
+              <w:rPr>
+                <w:b w:val="false"/>
+                <w:bCs w:val="false"/>
+                <w:sz w:val="14"/>
+                <w:szCs w:val="14"/>
+              </w:rPr>
+              <w:t xml:space="preserve">1</w:t>
+            </w:r>
+          </w:p>
+        </w:tc>
+        <w:tc>
+          <w:tcPr>
+            <w:tcW w:type="dxa" w:w="770"/>
+            <w:tcMar>
+              <w:top w:type="dxa" w:w="30"/>
+              <w:left w:type="dxa" w:w="40"/>
+              <w:bottom w:type="dxa" w:w="30"/>
+              <w:right w:type="dxa" w:w="40"/>
+            </w:tcMar>
+            <w:vAlign w:val="center"/>
+          </w:tcPr>
+          <w:p>
+            <w:pPr>
+              <w:jc w:val="center"/>
+            </w:pPr>
+            <w:r>
+              <w:rPr>
+                <w:b w:val="false"/>
+                <w:bCs w:val="false"/>
+                <w:sz w:val="14"/>
+                <w:szCs w:val="14"/>
+              </w:rPr>
+              <w:t xml:space="preserve">0</w:t>
+            </w:r>
+          </w:p>
+        </w:tc>
+        <w:tc>
+          <w:tcPr>
+            <w:tcW w:type="dxa" w:w="770"/>
+            <w:tcMar>
+              <w:top w:type="dxa" w:w="30"/>
+              <w:left w:type="dxa" w:w="40"/>
+              <w:bottom w:type="dxa" w:w="30"/>
+              <w:right w:type="dxa" w:w="40"/>
+            </w:tcMar>
+            <w:vAlign w:val="center"/>
+          </w:tcPr>
+          <w:p>
+            <w:pPr>
+              <w:jc w:val="center"/>
+            </w:pPr>
+            <w:r>
+              <w:rPr>
+                <w:b w:val="false"/>
+                <w:bCs w:val="false"/>
+                <w:sz w:val="14"/>
+                <w:szCs w:val="14"/>
+              </w:rPr>
+              <w:t xml:space="preserve">0, 0</w:t>
+            </w:r>
+          </w:p>
+        </w:tc>
+        <w:tc>
+          <w:tcPr>
+            <w:tcW w:type="dxa" w:w="616"/>
+            <w:tcMar>
+              <w:top w:type="dxa" w:w="30"/>
+              <w:left w:type="dxa" w:w="40"/>
+              <w:bottom w:type="dxa" w:w="30"/>
+              <w:right w:type="dxa" w:w="40"/>
+            </w:tcMar>
+            <w:vAlign w:val="center"/>
+          </w:tcPr>
+          <w:p>
+            <w:pPr>
+              <w:jc w:val="center"/>
+            </w:pPr>
+            <w:r>
+              <w:rPr>
+                <w:b w:val="false"/>
+                <w:bCs w:val="false"/>
+                <w:sz w:val="14"/>
+                <w:szCs w:val="14"/>
+              </w:rPr>
+              <w:t xml:space="preserve">0</w:t>
+            </w:r>
+          </w:p>
+        </w:tc>
+        <w:tc>
+          <w:tcPr>
+            <w:tcW w:type="dxa" w:w="572"/>
+            <w:tcMar>
+              <w:top w:type="dxa" w:w="30"/>
+              <w:left w:type="dxa" w:w="40"/>
+              <w:bottom w:type="dxa" w:w="30"/>
+              <w:right w:type="dxa" w:w="40"/>
+            </w:tcMar>
+            <w:vAlign w:val="center"/>
+          </w:tcPr>
+          <w:p>
+            <w:pPr>
+              <w:jc w:val="center"/>
+            </w:pPr>
+            <w:r>
+              <w:rPr>
+                <w:b w:val="false"/>
+                <w:bCs w:val="false"/>
+                <w:sz w:val="14"/>
+                <w:szCs w:val="14"/>
+              </w:rPr>
+              <w:t xml:space="preserve">0</w:t>
+            </w:r>
+          </w:p>
+        </w:tc>
+        <w:tc>
+          <w:tcPr>
+            <w:tcW w:type="dxa" w:w="528"/>
+            <w:tcMar>
+              <w:top w:type="dxa" w:w="30"/>
+              <w:left w:type="dxa" w:w="40"/>
+              <w:bottom w:type="dxa" w:w="30"/>
+              <w:right w:type="dxa" w:w="40"/>
+            </w:tcMar>
+            <w:vAlign w:val="center"/>
+          </w:tcPr>
+          <w:p>
+            <w:pPr>
+              <w:jc w:val="center"/>
+            </w:pPr>
+            <w:r>
+              <w:rPr>
+                <w:b w:val="false"/>
+                <w:bCs w:val="false"/>
+                <w:sz w:val="14"/>
+                <w:szCs w:val="14"/>
+              </w:rPr>
+              <w:t xml:space="preserve">0</w:t>
+            </w:r>
+          </w:p>
+        </w:tc>
+        <w:tc>
+          <w:tcPr>
+            <w:tcW w:type="dxa" w:w="726"/>
+            <w:tcMar>
+              <w:top w:type="dxa" w:w="30"/>
+              <w:left w:type="dxa" w:w="40"/>
+              <w:bottom w:type="dxa" w:w="30"/>
+              <w:right w:type="dxa" w:w="40"/>
+            </w:tcMar>
+            <w:vAlign w:val="center"/>
+          </w:tcPr>
+          <w:p>
+            <w:pPr>
+              <w:jc w:val="center"/>
+            </w:pPr>
+            <w:r>
+              <w:rPr>
+                <w:b w:val="false"/>
+                <w:bCs w:val="false"/>
+                <w:sz w:val="14"/>
+                <w:szCs w:val="14"/>
+              </w:rPr>
+              <w:t xml:space="preserve">0</w:t>
+            </w:r>
+          </w:p>
+        </w:tc>
+        <w:tc>
+          <w:tcPr>
+            <w:tcW w:type="dxa" w:w="748"/>
+            <w:tcMar>
+              <w:top w:type="dxa" w:w="30"/>
+              <w:left w:type="dxa" w:w="40"/>
+              <w:bottom w:type="dxa" w:w="30"/>
+              <w:right w:type="dxa" w:w="40"/>
+            </w:tcMar>
+            <w:vAlign w:val="center"/>
+          </w:tcPr>
+          <w:p>
+            <w:pPr>
+              <w:jc w:val="center"/>
+            </w:pPr>
+            <w:r>
+              <w:rPr>
+                <w:b w:val="false"/>
+                <w:bCs w:val="false"/>
+                <w:sz w:val="14"/>
+                <w:szCs w:val="14"/>
+              </w:rPr>
+              <w:t xml:space="preserve">0</w:t>
+            </w:r>
+          </w:p>
+        </w:tc>
+        <w:tc>
+          <w:tcPr>
+            <w:tcW w:type="dxa" w:w="770"/>
+            <w:tcMar>
+              <w:top w:type="dxa" w:w="30"/>
+              <w:left w:type="dxa" w:w="40"/>
+              <w:bottom w:type="dxa" w:w="30"/>
+              <w:right w:type="dxa" w:w="40"/>
+            </w:tcMar>
+            <w:vAlign w:val="center"/>
+          </w:tcPr>
+          <w:p>
+            <w:pPr>
+              <w:jc w:val="center"/>
+            </w:pPr>
+            <w:r>
+              <w:rPr>
+                <w:b w:val="false"/>
+                <w:bCs w:val="false"/>
+                <w:sz w:val="14"/>
+                <w:szCs w:val="14"/>
+              </w:rPr>
+              <w:t xml:space="preserve">00000</w:t>
+            </w:r>
+          </w:p>
+        </w:tc>
+      </w:tr>
+      <w:tr>
+        <w:tc>
+          <w:tcPr>
+            <w:tcW w:type="dxa" w:w="1815"/>
+            <w:shd w:fill="F6F6F6" w:val="clear"/>
+            <w:tcMar>
+              <w:top w:type="dxa" w:w="30"/>
+              <w:left w:type="dxa" w:w="40"/>
+              <w:bottom w:type="dxa" w:w="30"/>
+              <w:right w:type="dxa" w:w="40"/>
+            </w:tcMar>
+            <w:vAlign w:val="center"/>
+          </w:tcPr>
+          <w:p>
+            <w:pPr>
+              <w:jc w:val="left"/>
+            </w:pPr>
+            <w:r>
+              <w:rPr>
+                <w:b/>
+                <w:bCs/>
+                <w:sz w:val="14"/>
+                <w:szCs w:val="14"/>
+              </w:rPr>
+              <w:t xml:space="preserve">sw</w:t>
             </w:r>
           </w:p>
         </w:tc>
@@ -5028,7 +6511,7 @@
                 <w:sz w:val="14"/>
                 <w:szCs w:val="14"/>
               </w:rPr>
-              <w:t xml:space="preserve">0</w:t>
+              <w:t xml:space="preserve">X</w:t>
             </w:r>
           </w:p>
         </w:tc>
@@ -5082,61 +6565,61 @@
                 <w:sz w:val="14"/>
                 <w:szCs w:val="14"/>
               </w:rPr>
+              <w:t xml:space="preserve">X</w:t>
+            </w:r>
+          </w:p>
+        </w:tc>
+        <w:tc>
+          <w:tcPr>
+            <w:tcW w:type="dxa" w:w="770"/>
+            <w:shd w:fill="F6F6F6" w:val="clear"/>
+            <w:tcMar>
+              <w:top w:type="dxa" w:w="30"/>
+              <w:left w:type="dxa" w:w="40"/>
+              <w:bottom w:type="dxa" w:w="30"/>
+              <w:right w:type="dxa" w:w="40"/>
+            </w:tcMar>
+            <w:vAlign w:val="center"/>
+          </w:tcPr>
+          <w:p>
+            <w:pPr>
+              <w:jc w:val="center"/>
+            </w:pPr>
+            <w:r>
+              <w:rPr>
+                <w:b w:val="false"/>
+                <w:bCs w:val="false"/>
+                <w:sz w:val="14"/>
+                <w:szCs w:val="14"/>
+              </w:rPr>
+              <w:t xml:space="preserve">0</w:t>
+            </w:r>
+          </w:p>
+        </w:tc>
+        <w:tc>
+          <w:tcPr>
+            <w:tcW w:type="dxa" w:w="770"/>
+            <w:shd w:fill="F6F6F6" w:val="clear"/>
+            <w:tcMar>
+              <w:top w:type="dxa" w:w="30"/>
+              <w:left w:type="dxa" w:w="40"/>
+              <w:bottom w:type="dxa" w:w="30"/>
+              <w:right w:type="dxa" w:w="40"/>
+            </w:tcMar>
+            <w:vAlign w:val="center"/>
+          </w:tcPr>
+          <w:p>
+            <w:pPr>
+              <w:jc w:val="center"/>
+            </w:pPr>
+            <w:r>
+              <w:rPr>
+                <w:b w:val="false"/>
+                <w:bCs w:val="false"/>
+                <w:sz w:val="14"/>
+                <w:szCs w:val="14"/>
+              </w:rPr>
               <w:t xml:space="preserve">1</w:t>
-            </w:r>
-          </w:p>
-        </w:tc>
-        <w:tc>
-          <w:tcPr>
-            <w:tcW w:type="dxa" w:w="770"/>
-            <w:shd w:fill="F6F6F6" w:val="clear"/>
-            <w:tcMar>
-              <w:top w:type="dxa" w:w="30"/>
-              <w:left w:type="dxa" w:w="40"/>
-              <w:bottom w:type="dxa" w:w="30"/>
-              <w:right w:type="dxa" w:w="40"/>
-            </w:tcMar>
-            <w:vAlign w:val="center"/>
-          </w:tcPr>
-          <w:p>
-            <w:pPr>
-              <w:jc w:val="center"/>
-            </w:pPr>
-            <w:r>
-              <w:rPr>
-                <w:b w:val="false"/>
-                <w:bCs w:val="false"/>
-                <w:sz w:val="14"/>
-                <w:szCs w:val="14"/>
-              </w:rPr>
-              <w:t xml:space="preserve">1</w:t>
-            </w:r>
-          </w:p>
-        </w:tc>
-        <w:tc>
-          <w:tcPr>
-            <w:tcW w:type="dxa" w:w="770"/>
-            <w:shd w:fill="F6F6F6" w:val="clear"/>
-            <w:tcMar>
-              <w:top w:type="dxa" w:w="30"/>
-              <w:left w:type="dxa" w:w="40"/>
-              <w:bottom w:type="dxa" w:w="30"/>
-              <w:right w:type="dxa" w:w="40"/>
-            </w:tcMar>
-            <w:vAlign w:val="center"/>
-          </w:tcPr>
-          <w:p>
-            <w:pPr>
-              <w:jc w:val="center"/>
-            </w:pPr>
-            <w:r>
-              <w:rPr>
-                <w:b w:val="false"/>
-                <w:bCs w:val="false"/>
-                <w:sz w:val="14"/>
-                <w:szCs w:val="14"/>
-              </w:rPr>
-              <w:t xml:space="preserve">0</w:t>
             </w:r>
           </w:p>
         </w:tc>
@@ -5325,7 +6808,7 @@
                 <w:sz w:val="14"/>
                 <w:szCs w:val="14"/>
               </w:rPr>
-              <w:t xml:space="preserve">0000</w:t>
+              <w:t xml:space="preserve">00000</w:t>
             </w:r>
           </w:p>
         </w:tc>
@@ -5353,7 +6836,7 @@
                 <w:sz w:val="14"/>
                 <w:szCs w:val="14"/>
               </w:rPr>
-              <w:t xml:space="preserve">sw</w:t>
+              <w:t xml:space="preserve">beq</w:t>
             </w:r>
           </w:p>
         </w:tc>
@@ -5405,7 +6888,7 @@
                 <w:sz w:val="14"/>
                 <w:szCs w:val="14"/>
               </w:rPr>
-              <w:t xml:space="preserve">1</w:t>
+              <w:t xml:space="preserve">0</w:t>
             </w:r>
           </w:p>
         </w:tc>
@@ -5483,33 +6966,33 @@
                 <w:sz w:val="14"/>
                 <w:szCs w:val="14"/>
               </w:rPr>
-              <w:t xml:space="preserve">1</w:t>
-            </w:r>
-          </w:p>
-        </w:tc>
-        <w:tc>
-          <w:tcPr>
-            <w:tcW w:type="dxa" w:w="770"/>
-            <w:tcMar>
-              <w:top w:type="dxa" w:w="30"/>
-              <w:left w:type="dxa" w:w="40"/>
-              <w:bottom w:type="dxa" w:w="30"/>
-              <w:right w:type="dxa" w:w="40"/>
-            </w:tcMar>
-            <w:vAlign w:val="center"/>
-          </w:tcPr>
-          <w:p>
-            <w:pPr>
-              <w:jc w:val="center"/>
-            </w:pPr>
-            <w:r>
-              <w:rPr>
-                <w:b w:val="false"/>
-                <w:bCs w:val="false"/>
-                <w:sz w:val="14"/>
-                <w:szCs w:val="14"/>
-              </w:rPr>
-              <w:t xml:space="preserve">0, 0</w:t>
+              <w:t xml:space="preserve">0</w:t>
+            </w:r>
+          </w:p>
+        </w:tc>
+        <w:tc>
+          <w:tcPr>
+            <w:tcW w:type="dxa" w:w="770"/>
+            <w:tcMar>
+              <w:top w:type="dxa" w:w="30"/>
+              <w:left w:type="dxa" w:w="40"/>
+              <w:bottom w:type="dxa" w:w="30"/>
+              <w:right w:type="dxa" w:w="40"/>
+            </w:tcMar>
+            <w:vAlign w:val="center"/>
+          </w:tcPr>
+          <w:p>
+            <w:pPr>
+              <w:jc w:val="center"/>
+            </w:pPr>
+            <w:r>
+              <w:rPr>
+                <w:b w:val="false"/>
+                <w:bCs w:val="false"/>
+                <w:sz w:val="14"/>
+                <w:szCs w:val="14"/>
+              </w:rPr>
+              <w:t xml:space="preserve">1, 0</w:t>
             </w:r>
           </w:p>
         </w:tc>
@@ -5665,7 +7148,7 @@
                 <w:sz w:val="14"/>
                 <w:szCs w:val="14"/>
               </w:rPr>
-              <w:t xml:space="preserve">0000</w:t>
+              <w:t xml:space="preserve">00001</w:t>
             </w:r>
           </w:p>
         </w:tc>
@@ -5694,7 +7177,7 @@
                 <w:sz w:val="14"/>
                 <w:szCs w:val="14"/>
               </w:rPr>
-              <w:t xml:space="preserve">beq</w:t>
+              <w:t xml:space="preserve">bne</w:t>
             </w:r>
           </w:p>
         </w:tc>
@@ -5856,7 +7339,7 @@
                 <w:sz w:val="14"/>
                 <w:szCs w:val="14"/>
               </w:rPr>
-              <w:t xml:space="preserve">1, 0</w:t>
+              <w:t xml:space="preserve">1, 1</w:t>
             </w:r>
           </w:p>
         </w:tc>
@@ -6018,7 +7501,7 @@
                 <w:sz w:val="14"/>
                 <w:szCs w:val="14"/>
               </w:rPr>
-              <w:t xml:space="preserve">0001</w:t>
+              <w:t xml:space="preserve">00001</w:t>
             </w:r>
           </w:p>
         </w:tc>
@@ -6046,7 +7529,7 @@
                 <w:sz w:val="14"/>
                 <w:szCs w:val="14"/>
               </w:rPr>
-              <w:t xml:space="preserve">bne</w:t>
+              <w:t xml:space="preserve">addi</w:t>
             </w:r>
           </w:p>
         </w:tc>
@@ -6072,7 +7555,7 @@
                 <w:sz w:val="14"/>
                 <w:szCs w:val="14"/>
               </w:rPr>
-              <w:t xml:space="preserve">X</w:t>
+              <w:t xml:space="preserve">0</w:t>
             </w:r>
           </w:p>
         </w:tc>
@@ -6098,111 +7581,111 @@
                 <w:sz w:val="14"/>
                 <w:szCs w:val="14"/>
               </w:rPr>
-              <w:t xml:space="preserve">0</w:t>
-            </w:r>
-          </w:p>
-        </w:tc>
-        <w:tc>
-          <w:tcPr>
-            <w:tcW w:type="dxa" w:w="770"/>
-            <w:tcMar>
-              <w:top w:type="dxa" w:w="30"/>
-              <w:left w:type="dxa" w:w="40"/>
-              <w:bottom w:type="dxa" w:w="30"/>
-              <w:right w:type="dxa" w:w="40"/>
-            </w:tcMar>
-            <w:vAlign w:val="center"/>
-          </w:tcPr>
-          <w:p>
-            <w:pPr>
-              <w:jc w:val="center"/>
-            </w:pPr>
-            <w:r>
-              <w:rPr>
-                <w:b w:val="false"/>
-                <w:bCs w:val="false"/>
-                <w:sz w:val="14"/>
-                <w:szCs w:val="14"/>
-              </w:rPr>
-              <w:t xml:space="preserve">X</w:t>
-            </w:r>
-          </w:p>
-        </w:tc>
-        <w:tc>
-          <w:tcPr>
-            <w:tcW w:type="dxa" w:w="770"/>
-            <w:tcMar>
-              <w:top w:type="dxa" w:w="30"/>
-              <w:left w:type="dxa" w:w="40"/>
-              <w:bottom w:type="dxa" w:w="30"/>
-              <w:right w:type="dxa" w:w="40"/>
-            </w:tcMar>
-            <w:vAlign w:val="center"/>
-          </w:tcPr>
-          <w:p>
-            <w:pPr>
-              <w:jc w:val="center"/>
-            </w:pPr>
-            <w:r>
-              <w:rPr>
-                <w:b w:val="false"/>
-                <w:bCs w:val="false"/>
-                <w:sz w:val="14"/>
-                <w:szCs w:val="14"/>
-              </w:rPr>
-              <w:t xml:space="preserve">0</w:t>
-            </w:r>
-          </w:p>
-        </w:tc>
-        <w:tc>
-          <w:tcPr>
-            <w:tcW w:type="dxa" w:w="770"/>
-            <w:tcMar>
-              <w:top w:type="dxa" w:w="30"/>
-              <w:left w:type="dxa" w:w="40"/>
-              <w:bottom w:type="dxa" w:w="30"/>
-              <w:right w:type="dxa" w:w="40"/>
-            </w:tcMar>
-            <w:vAlign w:val="center"/>
-          </w:tcPr>
-          <w:p>
-            <w:pPr>
-              <w:jc w:val="center"/>
-            </w:pPr>
-            <w:r>
-              <w:rPr>
-                <w:b w:val="false"/>
-                <w:bCs w:val="false"/>
-                <w:sz w:val="14"/>
-                <w:szCs w:val="14"/>
-              </w:rPr>
-              <w:t xml:space="preserve">0</w:t>
-            </w:r>
-          </w:p>
-        </w:tc>
-        <w:tc>
-          <w:tcPr>
-            <w:tcW w:type="dxa" w:w="770"/>
-            <w:tcMar>
-              <w:top w:type="dxa" w:w="30"/>
-              <w:left w:type="dxa" w:w="40"/>
-              <w:bottom w:type="dxa" w:w="30"/>
-              <w:right w:type="dxa" w:w="40"/>
-            </w:tcMar>
-            <w:vAlign w:val="center"/>
-          </w:tcPr>
-          <w:p>
-            <w:pPr>
-              <w:jc w:val="center"/>
-            </w:pPr>
-            <w:r>
-              <w:rPr>
-                <w:b w:val="false"/>
-                <w:bCs w:val="false"/>
-                <w:sz w:val="14"/>
-                <w:szCs w:val="14"/>
-              </w:rPr>
-              <w:t xml:space="preserve">1, 1</w:t>
+              <w:t xml:space="preserve">1</w:t>
+            </w:r>
+          </w:p>
+        </w:tc>
+        <w:tc>
+          <w:tcPr>
+            <w:tcW w:type="dxa" w:w="770"/>
+            <w:tcMar>
+              <w:top w:type="dxa" w:w="30"/>
+              <w:left w:type="dxa" w:w="40"/>
+              <w:bottom w:type="dxa" w:w="30"/>
+              <w:right w:type="dxa" w:w="40"/>
+            </w:tcMar>
+            <w:vAlign w:val="center"/>
+          </w:tcPr>
+          <w:p>
+            <w:pPr>
+              <w:jc w:val="center"/>
+            </w:pPr>
+            <w:r>
+              <w:rPr>
+                <w:b w:val="false"/>
+                <w:bCs w:val="false"/>
+                <w:sz w:val="14"/>
+                <w:szCs w:val="14"/>
+              </w:rPr>
+              <w:t xml:space="preserve">0</w:t>
+            </w:r>
+          </w:p>
+        </w:tc>
+        <w:tc>
+          <w:tcPr>
+            <w:tcW w:type="dxa" w:w="770"/>
+            <w:tcMar>
+              <w:top w:type="dxa" w:w="30"/>
+              <w:left w:type="dxa" w:w="40"/>
+              <w:bottom w:type="dxa" w:w="30"/>
+              <w:right w:type="dxa" w:w="40"/>
+            </w:tcMar>
+            <w:vAlign w:val="center"/>
+          </w:tcPr>
+          <w:p>
+            <w:pPr>
+              <w:jc w:val="center"/>
+            </w:pPr>
+            <w:r>
+              <w:rPr>
+                <w:b w:val="false"/>
+                <w:bCs w:val="false"/>
+                <w:sz w:val="14"/>
+                <w:szCs w:val="14"/>
+              </w:rPr>
+              <w:t xml:space="preserve">1</w:t>
+            </w:r>
+          </w:p>
+        </w:tc>
+        <w:tc>
+          <w:tcPr>
+            <w:tcW w:type="dxa" w:w="770"/>
+            <w:tcMar>
+              <w:top w:type="dxa" w:w="30"/>
+              <w:left w:type="dxa" w:w="40"/>
+              <w:bottom w:type="dxa" w:w="30"/>
+              <w:right w:type="dxa" w:w="40"/>
+            </w:tcMar>
+            <w:vAlign w:val="center"/>
+          </w:tcPr>
+          <w:p>
+            <w:pPr>
+              <w:jc w:val="center"/>
+            </w:pPr>
+            <w:r>
+              <w:rPr>
+                <w:b w:val="false"/>
+                <w:bCs w:val="false"/>
+                <w:sz w:val="14"/>
+                <w:szCs w:val="14"/>
+              </w:rPr>
+              <w:t xml:space="preserve">0</w:t>
+            </w:r>
+          </w:p>
+        </w:tc>
+        <w:tc>
+          <w:tcPr>
+            <w:tcW w:type="dxa" w:w="770"/>
+            <w:tcMar>
+              <w:top w:type="dxa" w:w="30"/>
+              <w:left w:type="dxa" w:w="40"/>
+              <w:bottom w:type="dxa" w:w="30"/>
+              <w:right w:type="dxa" w:w="40"/>
+            </w:tcMar>
+            <w:vAlign w:val="center"/>
+          </w:tcPr>
+          <w:p>
+            <w:pPr>
+              <w:jc w:val="center"/>
+            </w:pPr>
+            <w:r>
+              <w:rPr>
+                <w:b w:val="false"/>
+                <w:bCs w:val="false"/>
+                <w:sz w:val="14"/>
+                <w:szCs w:val="14"/>
+              </w:rPr>
+              <w:t xml:space="preserve">0, 0</w:t>
             </w:r>
           </w:p>
         </w:tc>
@@ -6358,7 +7841,7 @@
                 <w:sz w:val="14"/>
                 <w:szCs w:val="14"/>
               </w:rPr>
-              <w:t xml:space="preserve">0001</w:t>
+              <w:t xml:space="preserve">00000</w:t>
             </w:r>
           </w:p>
         </w:tc>
@@ -6387,7 +7870,7 @@
                 <w:sz w:val="14"/>
                 <w:szCs w:val="14"/>
               </w:rPr>
-              <w:t xml:space="preserve">addi</w:t>
+              <w:t xml:space="preserve">addiu</w:t>
             </w:r>
           </w:p>
         </w:tc>
@@ -6711,7 +8194,7 @@
                 <w:sz w:val="14"/>
                 <w:szCs w:val="14"/>
               </w:rPr>
-              <w:t xml:space="preserve">0000</w:t>
+              <w:t xml:space="preserve">00000</w:t>
             </w:r>
           </w:p>
         </w:tc>
@@ -6739,7 +8222,7 @@
                 <w:sz w:val="14"/>
                 <w:szCs w:val="14"/>
               </w:rPr>
-              <w:t xml:space="preserve">addiu</w:t>
+              <w:t xml:space="preserve">andi</w:t>
             </w:r>
           </w:p>
         </w:tc>
@@ -7051,7 +8534,7 @@
                 <w:sz w:val="14"/>
                 <w:szCs w:val="14"/>
               </w:rPr>
-              <w:t xml:space="preserve">0000</w:t>
+              <w:t xml:space="preserve">00010</w:t>
             </w:r>
           </w:p>
         </w:tc>
@@ -7080,7 +8563,7 @@
                 <w:sz w:val="14"/>
                 <w:szCs w:val="14"/>
               </w:rPr>
-              <w:t xml:space="preserve">andi</w:t>
+              <w:t xml:space="preserve">ori</w:t>
             </w:r>
           </w:p>
         </w:tc>
@@ -7404,7 +8887,7 @@
                 <w:sz w:val="14"/>
                 <w:szCs w:val="14"/>
               </w:rPr>
-              <w:t xml:space="preserve">0010</w:t>
+              <w:t xml:space="preserve">00011</w:t>
             </w:r>
           </w:p>
         </w:tc>
@@ -7432,7 +8915,7 @@
                 <w:sz w:val="14"/>
                 <w:szCs w:val="14"/>
               </w:rPr>
-              <w:t xml:space="preserve">ori</w:t>
+              <w:t xml:space="preserve">xori</w:t>
             </w:r>
           </w:p>
         </w:tc>
@@ -7744,7 +9227,7 @@
                 <w:sz w:val="14"/>
                 <w:szCs w:val="14"/>
               </w:rPr>
-              <w:t xml:space="preserve">0011</w:t>
+              <w:t xml:space="preserve">00100</w:t>
             </w:r>
           </w:p>
         </w:tc>
@@ -7773,7 +9256,7 @@
                 <w:sz w:val="14"/>
                 <w:szCs w:val="14"/>
               </w:rPr>
-              <w:t xml:space="preserve">xori</w:t>
+              <w:t xml:space="preserve">slti</w:t>
             </w:r>
           </w:p>
         </w:tc>
@@ -8097,7 +9580,7 @@
                 <w:sz w:val="14"/>
                 <w:szCs w:val="14"/>
               </w:rPr>
-              <w:t xml:space="preserve">0100</w:t>
+              <w:t xml:space="preserve">01000</w:t>
             </w:r>
           </w:p>
         </w:tc>
@@ -8125,7 +9608,7 @@
                 <w:sz w:val="14"/>
                 <w:szCs w:val="14"/>
               </w:rPr>
-              <w:t xml:space="preserve">slti</w:t>
+              <w:t xml:space="preserve">sltiu</w:t>
             </w:r>
           </w:p>
         </w:tc>
@@ -8437,7 +9920,7 @@
                 <w:sz w:val="14"/>
                 <w:szCs w:val="14"/>
               </w:rPr>
-              <w:t xml:space="preserve">1000</w:t>
+              <w:t xml:space="preserve">01001</w:t>
             </w:r>
           </w:p>
         </w:tc>
@@ -8466,7 +9949,7 @@
                 <w:sz w:val="14"/>
                 <w:szCs w:val="14"/>
               </w:rPr>
-              <w:t xml:space="preserve">sltiu</w:t>
+              <w:t xml:space="preserve">j</w:t>
             </w:r>
           </w:p>
         </w:tc>
@@ -8493,7 +9976,7 @@
                 <w:sz w:val="14"/>
                 <w:szCs w:val="14"/>
               </w:rPr>
-              <w:t xml:space="preserve">0</w:t>
+              <w:t xml:space="preserve">X</w:t>
             </w:r>
           </w:p>
         </w:tc>
@@ -8520,7 +10003,7 @@
                 <w:sz w:val="14"/>
                 <w:szCs w:val="14"/>
               </w:rPr>
-              <w:t xml:space="preserve">1</w:t>
+              <w:t xml:space="preserve">X</w:t>
             </w:r>
           </w:p>
         </w:tc>
@@ -8547,7 +10030,7 @@
                 <w:sz w:val="14"/>
                 <w:szCs w:val="14"/>
               </w:rPr>
-              <w:t xml:space="preserve">0</w:t>
+              <w:t xml:space="preserve">X</w:t>
             </w:r>
           </w:p>
         </w:tc>
@@ -8574,7 +10057,7 @@
                 <w:sz w:val="14"/>
                 <w:szCs w:val="14"/>
               </w:rPr>
-              <w:t xml:space="preserve">1</w:t>
+              <w:t xml:space="preserve">0</w:t>
             </w:r>
           </w:p>
         </w:tc>
@@ -8655,7 +10138,7 @@
                 <w:sz w:val="14"/>
                 <w:szCs w:val="14"/>
               </w:rPr>
-              <w:t xml:space="preserve">0</w:t>
+              <w:t xml:space="preserve">1</w:t>
             </w:r>
           </w:p>
         </w:tc>
@@ -8790,7 +10273,7 @@
                 <w:sz w:val="14"/>
                 <w:szCs w:val="14"/>
               </w:rPr>
-              <w:t xml:space="preserve">1001</w:t>
+              <w:t xml:space="preserve">X</w:t>
             </w:r>
           </w:p>
         </w:tc>
@@ -8799,6 +10282,7 @@
         <w:tc>
           <w:tcPr>
             <w:tcW w:type="dxa" w:w="1815"/>
+            <w:shd w:fill="DCE7F5" w:val="clear"/>
             <w:tcMar>
               <w:top w:type="dxa" w:w="30"/>
               <w:left w:type="dxa" w:w="40"/>
@@ -8818,13 +10302,14 @@
                 <w:sz w:val="14"/>
                 <w:szCs w:val="14"/>
               </w:rPr>
-              <w:t xml:space="preserve">j</w:t>
+              <w:t xml:space="preserve">jal  (added)</w:t>
             </w:r>
           </w:p>
         </w:tc>
         <w:tc>
           <w:tcPr>
             <w:tcW w:type="dxa" w:w="682"/>
+            <w:shd w:fill="DCE7F5" w:val="clear"/>
             <w:tcMar>
               <w:top w:type="dxa" w:w="30"/>
               <w:left w:type="dxa" w:w="40"/>
@@ -8851,6 +10336,7 @@
         <w:tc>
           <w:tcPr>
             <w:tcW w:type="dxa" w:w="682"/>
+            <w:shd w:fill="DCE7F5" w:val="clear"/>
             <w:tcMar>
               <w:top w:type="dxa" w:w="30"/>
               <w:left w:type="dxa" w:w="40"/>
@@ -8877,6 +10363,7 @@
         <w:tc>
           <w:tcPr>
             <w:tcW w:type="dxa" w:w="770"/>
+            <w:shd w:fill="DCE7F5" w:val="clear"/>
             <w:tcMar>
               <w:top w:type="dxa" w:w="30"/>
               <w:left w:type="dxa" w:w="40"/>
@@ -8903,58 +10390,61 @@
         <w:tc>
           <w:tcPr>
             <w:tcW w:type="dxa" w:w="770"/>
-            <w:tcMar>
-              <w:top w:type="dxa" w:w="30"/>
-              <w:left w:type="dxa" w:w="40"/>
-              <w:bottom w:type="dxa" w:w="30"/>
-              <w:right w:type="dxa" w:w="40"/>
-            </w:tcMar>
-            <w:vAlign w:val="center"/>
-          </w:tcPr>
-          <w:p>
-            <w:pPr>
-              <w:jc w:val="center"/>
-            </w:pPr>
-            <w:r>
-              <w:rPr>
-                <w:b w:val="false"/>
-                <w:bCs w:val="false"/>
-                <w:sz w:val="14"/>
-                <w:szCs w:val="14"/>
-              </w:rPr>
-              <w:t xml:space="preserve">0</w:t>
-            </w:r>
-          </w:p>
-        </w:tc>
-        <w:tc>
-          <w:tcPr>
-            <w:tcW w:type="dxa" w:w="770"/>
-            <w:tcMar>
-              <w:top w:type="dxa" w:w="30"/>
-              <w:left w:type="dxa" w:w="40"/>
-              <w:bottom w:type="dxa" w:w="30"/>
-              <w:right w:type="dxa" w:w="40"/>
-            </w:tcMar>
-            <w:vAlign w:val="center"/>
-          </w:tcPr>
-          <w:p>
-            <w:pPr>
-              <w:jc w:val="center"/>
-            </w:pPr>
-            <w:r>
-              <w:rPr>
-                <w:b w:val="false"/>
-                <w:bCs w:val="false"/>
-                <w:sz w:val="14"/>
-                <w:szCs w:val="14"/>
-              </w:rPr>
-              <w:t xml:space="preserve">0</w:t>
-            </w:r>
-          </w:p>
-        </w:tc>
-        <w:tc>
-          <w:tcPr>
-            <w:tcW w:type="dxa" w:w="770"/>
+            <w:shd w:fill="DCE7F5" w:val="clear"/>
+            <w:tcMar>
+              <w:top w:type="dxa" w:w="30"/>
+              <w:left w:type="dxa" w:w="40"/>
+              <w:bottom w:type="dxa" w:w="30"/>
+              <w:right w:type="dxa" w:w="40"/>
+            </w:tcMar>
+            <w:vAlign w:val="center"/>
+          </w:tcPr>
+          <w:p>
+            <w:pPr>
+              <w:jc w:val="center"/>
+            </w:pPr>
+            <w:r>
+              <w:rPr>
+                <w:b w:val="false"/>
+                <w:bCs w:val="false"/>
+                <w:sz w:val="14"/>
+                <w:szCs w:val="14"/>
+              </w:rPr>
+              <w:t xml:space="preserve">1</w:t>
+            </w:r>
+          </w:p>
+        </w:tc>
+        <w:tc>
+          <w:tcPr>
+            <w:tcW w:type="dxa" w:w="770"/>
+            <w:shd w:fill="DCE7F5" w:val="clear"/>
+            <w:tcMar>
+              <w:top w:type="dxa" w:w="30"/>
+              <w:left w:type="dxa" w:w="40"/>
+              <w:bottom w:type="dxa" w:w="30"/>
+              <w:right w:type="dxa" w:w="40"/>
+            </w:tcMar>
+            <w:vAlign w:val="center"/>
+          </w:tcPr>
+          <w:p>
+            <w:pPr>
+              <w:jc w:val="center"/>
+            </w:pPr>
+            <w:r>
+              <w:rPr>
+                <w:b w:val="false"/>
+                <w:bCs w:val="false"/>
+                <w:sz w:val="14"/>
+                <w:szCs w:val="14"/>
+              </w:rPr>
+              <w:t xml:space="preserve">0</w:t>
+            </w:r>
+          </w:p>
+        </w:tc>
+        <w:tc>
+          <w:tcPr>
+            <w:tcW w:type="dxa" w:w="770"/>
+            <w:shd w:fill="DCE7F5" w:val="clear"/>
             <w:tcMar>
               <w:top w:type="dxa" w:w="30"/>
               <w:left w:type="dxa" w:w="40"/>
@@ -8981,6 +10471,7 @@
         <w:tc>
           <w:tcPr>
             <w:tcW w:type="dxa" w:w="616"/>
+            <w:shd w:fill="DCE7F5" w:val="clear"/>
             <w:tcMar>
               <w:top w:type="dxa" w:w="30"/>
               <w:left w:type="dxa" w:w="40"/>
@@ -9007,32 +10498,34 @@
         <w:tc>
           <w:tcPr>
             <w:tcW w:type="dxa" w:w="572"/>
-            <w:tcMar>
-              <w:top w:type="dxa" w:w="30"/>
-              <w:left w:type="dxa" w:w="40"/>
-              <w:bottom w:type="dxa" w:w="30"/>
-              <w:right w:type="dxa" w:w="40"/>
-            </w:tcMar>
-            <w:vAlign w:val="center"/>
-          </w:tcPr>
-          <w:p>
-            <w:pPr>
-              <w:jc w:val="center"/>
-            </w:pPr>
-            <w:r>
-              <w:rPr>
-                <w:b w:val="false"/>
-                <w:bCs w:val="false"/>
-                <w:sz w:val="14"/>
-                <w:szCs w:val="14"/>
-              </w:rPr>
-              <w:t xml:space="preserve">0</w:t>
+            <w:shd w:fill="DCE7F5" w:val="clear"/>
+            <w:tcMar>
+              <w:top w:type="dxa" w:w="30"/>
+              <w:left w:type="dxa" w:w="40"/>
+              <w:bottom w:type="dxa" w:w="30"/>
+              <w:right w:type="dxa" w:w="40"/>
+            </w:tcMar>
+            <w:vAlign w:val="center"/>
+          </w:tcPr>
+          <w:p>
+            <w:pPr>
+              <w:jc w:val="center"/>
+            </w:pPr>
+            <w:r>
+              <w:rPr>
+                <w:b w:val="false"/>
+                <w:bCs w:val="false"/>
+                <w:sz w:val="14"/>
+                <w:szCs w:val="14"/>
+              </w:rPr>
+              <w:t xml:space="preserve">1</w:t>
             </w:r>
           </w:p>
         </w:tc>
         <w:tc>
           <w:tcPr>
             <w:tcW w:type="dxa" w:w="528"/>
+            <w:shd w:fill="DCE7F5" w:val="clear"/>
             <w:tcMar>
               <w:top w:type="dxa" w:w="30"/>
               <w:left w:type="dxa" w:w="40"/>
@@ -9059,6 +10552,7 @@
         <w:tc>
           <w:tcPr>
             <w:tcW w:type="dxa" w:w="726"/>
+            <w:shd w:fill="DCE7F5" w:val="clear"/>
             <w:tcMar>
               <w:top w:type="dxa" w:w="30"/>
               <w:left w:type="dxa" w:w="40"/>
@@ -9085,32 +10579,34 @@
         <w:tc>
           <w:tcPr>
             <w:tcW w:type="dxa" w:w="748"/>
-            <w:tcMar>
-              <w:top w:type="dxa" w:w="30"/>
-              <w:left w:type="dxa" w:w="40"/>
-              <w:bottom w:type="dxa" w:w="30"/>
-              <w:right w:type="dxa" w:w="40"/>
-            </w:tcMar>
-            <w:vAlign w:val="center"/>
-          </w:tcPr>
-          <w:p>
-            <w:pPr>
-              <w:jc w:val="center"/>
-            </w:pPr>
-            <w:r>
-              <w:rPr>
-                <w:b w:val="false"/>
-                <w:bCs w:val="false"/>
-                <w:sz w:val="14"/>
-                <w:szCs w:val="14"/>
-              </w:rPr>
-              <w:t xml:space="preserve">0</w:t>
-            </w:r>
-          </w:p>
-        </w:tc>
-        <w:tc>
-          <w:tcPr>
-            <w:tcW w:type="dxa" w:w="770"/>
+            <w:shd w:fill="DCE7F5" w:val="clear"/>
+            <w:tcMar>
+              <w:top w:type="dxa" w:w="30"/>
+              <w:left w:type="dxa" w:w="40"/>
+              <w:bottom w:type="dxa" w:w="30"/>
+              <w:right w:type="dxa" w:w="40"/>
+            </w:tcMar>
+            <w:vAlign w:val="center"/>
+          </w:tcPr>
+          <w:p>
+            <w:pPr>
+              <w:jc w:val="center"/>
+            </w:pPr>
+            <w:r>
+              <w:rPr>
+                <w:b w:val="false"/>
+                <w:bCs w:val="false"/>
+                <w:sz w:val="14"/>
+                <w:szCs w:val="14"/>
+              </w:rPr>
+              <w:t xml:space="preserve">0</w:t>
+            </w:r>
+          </w:p>
+        </w:tc>
+        <w:tc>
+          <w:tcPr>
+            <w:tcW w:type="dxa" w:w="770"/>
+            <w:shd w:fill="DCE7F5" w:val="clear"/>
             <w:tcMar>
               <w:top w:type="dxa" w:w="30"/>
               <w:left w:type="dxa" w:w="40"/>
@@ -9139,7 +10635,7 @@
         <w:tc>
           <w:tcPr>
             <w:tcW w:type="dxa" w:w="1815"/>
-            <w:shd w:fill="DCE7F5" w:val="clear"/>
+            <w:shd w:fill="F6F6F6" w:val="clear"/>
             <w:tcMar>
               <w:top w:type="dxa" w:w="30"/>
               <w:left w:type="dxa" w:w="40"/>
@@ -9159,95 +10655,41 @@
                 <w:sz w:val="14"/>
                 <w:szCs w:val="14"/>
               </w:rPr>
-              <w:t xml:space="preserve">jal  (added)</w:t>
+              <w:t xml:space="preserve">lui</w:t>
             </w:r>
           </w:p>
         </w:tc>
         <w:tc>
           <w:tcPr>
             <w:tcW w:type="dxa" w:w="682"/>
-            <w:shd w:fill="DCE7F5" w:val="clear"/>
-            <w:tcMar>
-              <w:top w:type="dxa" w:w="30"/>
-              <w:left w:type="dxa" w:w="40"/>
-              <w:bottom w:type="dxa" w:w="30"/>
-              <w:right w:type="dxa" w:w="40"/>
-            </w:tcMar>
-            <w:vAlign w:val="center"/>
-          </w:tcPr>
-          <w:p>
-            <w:pPr>
-              <w:jc w:val="center"/>
-            </w:pPr>
-            <w:r>
-              <w:rPr>
-                <w:b w:val="false"/>
-                <w:bCs w:val="false"/>
-                <w:sz w:val="14"/>
-                <w:szCs w:val="14"/>
-              </w:rPr>
-              <w:t xml:space="preserve">X</w:t>
+            <w:shd w:fill="F6F6F6" w:val="clear"/>
+            <w:tcMar>
+              <w:top w:type="dxa" w:w="30"/>
+              <w:left w:type="dxa" w:w="40"/>
+              <w:bottom w:type="dxa" w:w="30"/>
+              <w:right w:type="dxa" w:w="40"/>
+            </w:tcMar>
+            <w:vAlign w:val="center"/>
+          </w:tcPr>
+          <w:p>
+            <w:pPr>
+              <w:jc w:val="center"/>
+            </w:pPr>
+            <w:r>
+              <w:rPr>
+                <w:b w:val="false"/>
+                <w:bCs w:val="false"/>
+                <w:sz w:val="14"/>
+                <w:szCs w:val="14"/>
+              </w:rPr>
+              <w:t xml:space="preserve">0</w:t>
             </w:r>
           </w:p>
         </w:tc>
         <w:tc>
           <w:tcPr>
             <w:tcW w:type="dxa" w:w="682"/>
-            <w:shd w:fill="DCE7F5" w:val="clear"/>
-            <w:tcMar>
-              <w:top w:type="dxa" w:w="30"/>
-              <w:left w:type="dxa" w:w="40"/>
-              <w:bottom w:type="dxa" w:w="30"/>
-              <w:right w:type="dxa" w:w="40"/>
-            </w:tcMar>
-            <w:vAlign w:val="center"/>
-          </w:tcPr>
-          <w:p>
-            <w:pPr>
-              <w:jc w:val="center"/>
-            </w:pPr>
-            <w:r>
-              <w:rPr>
-                <w:b w:val="false"/>
-                <w:bCs w:val="false"/>
-                <w:sz w:val="14"/>
-                <w:szCs w:val="14"/>
-              </w:rPr>
-              <w:t xml:space="preserve">X</w:t>
-            </w:r>
-          </w:p>
-        </w:tc>
-        <w:tc>
-          <w:tcPr>
-            <w:tcW w:type="dxa" w:w="770"/>
-            <w:shd w:fill="DCE7F5" w:val="clear"/>
-            <w:tcMar>
-              <w:top w:type="dxa" w:w="30"/>
-              <w:left w:type="dxa" w:w="40"/>
-              <w:bottom w:type="dxa" w:w="30"/>
-              <w:right w:type="dxa" w:w="40"/>
-            </w:tcMar>
-            <w:vAlign w:val="center"/>
-          </w:tcPr>
-          <w:p>
-            <w:pPr>
-              <w:jc w:val="center"/>
-            </w:pPr>
-            <w:r>
-              <w:rPr>
-                <w:b w:val="false"/>
-                <w:bCs w:val="false"/>
-                <w:sz w:val="14"/>
-                <w:szCs w:val="14"/>
-              </w:rPr>
-              <w:t xml:space="preserve">X</w:t>
-            </w:r>
-          </w:p>
-        </w:tc>
-        <w:tc>
-          <w:tcPr>
-            <w:tcW w:type="dxa" w:w="770"/>
-            <w:shd w:fill="DCE7F5" w:val="clear"/>
+            <w:shd w:fill="F6F6F6" w:val="clear"/>
             <w:tcMar>
               <w:top w:type="dxa" w:w="30"/>
               <w:left w:type="dxa" w:w="40"/>
@@ -9274,34 +10716,88 @@
         <w:tc>
           <w:tcPr>
             <w:tcW w:type="dxa" w:w="770"/>
-            <w:shd w:fill="DCE7F5" w:val="clear"/>
-            <w:tcMar>
-              <w:top w:type="dxa" w:w="30"/>
-              <w:left w:type="dxa" w:w="40"/>
-              <w:bottom w:type="dxa" w:w="30"/>
-              <w:right w:type="dxa" w:w="40"/>
-            </w:tcMar>
-            <w:vAlign w:val="center"/>
-          </w:tcPr>
-          <w:p>
-            <w:pPr>
-              <w:jc w:val="center"/>
-            </w:pPr>
-            <w:r>
-              <w:rPr>
-                <w:b w:val="false"/>
-                <w:bCs w:val="false"/>
-                <w:sz w:val="14"/>
-                <w:szCs w:val="14"/>
-              </w:rPr>
-              <w:t xml:space="preserve">0</w:t>
-            </w:r>
-          </w:p>
-        </w:tc>
-        <w:tc>
-          <w:tcPr>
-            <w:tcW w:type="dxa" w:w="770"/>
-            <w:shd w:fill="DCE7F5" w:val="clear"/>
+            <w:shd w:fill="F6F6F6" w:val="clear"/>
+            <w:tcMar>
+              <w:top w:type="dxa" w:w="30"/>
+              <w:left w:type="dxa" w:w="40"/>
+              <w:bottom w:type="dxa" w:w="30"/>
+              <w:right w:type="dxa" w:w="40"/>
+            </w:tcMar>
+            <w:vAlign w:val="center"/>
+          </w:tcPr>
+          <w:p>
+            <w:pPr>
+              <w:jc w:val="center"/>
+            </w:pPr>
+            <w:r>
+              <w:rPr>
+                <w:b w:val="false"/>
+                <w:bCs w:val="false"/>
+                <w:sz w:val="14"/>
+                <w:szCs w:val="14"/>
+              </w:rPr>
+              <w:t xml:space="preserve">0</w:t>
+            </w:r>
+          </w:p>
+        </w:tc>
+        <w:tc>
+          <w:tcPr>
+            <w:tcW w:type="dxa" w:w="770"/>
+            <w:shd w:fill="F6F6F6" w:val="clear"/>
+            <w:tcMar>
+              <w:top w:type="dxa" w:w="30"/>
+              <w:left w:type="dxa" w:w="40"/>
+              <w:bottom w:type="dxa" w:w="30"/>
+              <w:right w:type="dxa" w:w="40"/>
+            </w:tcMar>
+            <w:vAlign w:val="center"/>
+          </w:tcPr>
+          <w:p>
+            <w:pPr>
+              <w:jc w:val="center"/>
+            </w:pPr>
+            <w:r>
+              <w:rPr>
+                <w:b w:val="false"/>
+                <w:bCs w:val="false"/>
+                <w:sz w:val="14"/>
+                <w:szCs w:val="14"/>
+              </w:rPr>
+              <w:t xml:space="preserve">1</w:t>
+            </w:r>
+          </w:p>
+        </w:tc>
+        <w:tc>
+          <w:tcPr>
+            <w:tcW w:type="dxa" w:w="770"/>
+            <w:shd w:fill="F6F6F6" w:val="clear"/>
+            <w:tcMar>
+              <w:top w:type="dxa" w:w="30"/>
+              <w:left w:type="dxa" w:w="40"/>
+              <w:bottom w:type="dxa" w:w="30"/>
+              <w:right w:type="dxa" w:w="40"/>
+            </w:tcMar>
+            <w:vAlign w:val="center"/>
+          </w:tcPr>
+          <w:p>
+            <w:pPr>
+              <w:jc w:val="center"/>
+            </w:pPr>
+            <w:r>
+              <w:rPr>
+                <w:b w:val="false"/>
+                <w:bCs w:val="false"/>
+                <w:sz w:val="14"/>
+                <w:szCs w:val="14"/>
+              </w:rPr>
+              <w:t xml:space="preserve">0</w:t>
+            </w:r>
+          </w:p>
+        </w:tc>
+        <w:tc>
+          <w:tcPr>
+            <w:tcW w:type="dxa" w:w="770"/>
+            <w:shd w:fill="F6F6F6" w:val="clear"/>
             <w:tcMar>
               <w:top w:type="dxa" w:w="30"/>
               <w:left w:type="dxa" w:w="40"/>
@@ -9328,61 +10824,61 @@
         <w:tc>
           <w:tcPr>
             <w:tcW w:type="dxa" w:w="616"/>
-            <w:shd w:fill="DCE7F5" w:val="clear"/>
-            <w:tcMar>
-              <w:top w:type="dxa" w:w="30"/>
-              <w:left w:type="dxa" w:w="40"/>
-              <w:bottom w:type="dxa" w:w="30"/>
-              <w:right w:type="dxa" w:w="40"/>
-            </w:tcMar>
-            <w:vAlign w:val="center"/>
-          </w:tcPr>
-          <w:p>
-            <w:pPr>
-              <w:jc w:val="center"/>
-            </w:pPr>
-            <w:r>
-              <w:rPr>
-                <w:b w:val="false"/>
-                <w:bCs w:val="false"/>
-                <w:sz w:val="14"/>
-                <w:szCs w:val="14"/>
-              </w:rPr>
-              <w:t xml:space="preserve">1</w:t>
+            <w:shd w:fill="F6F6F6" w:val="clear"/>
+            <w:tcMar>
+              <w:top w:type="dxa" w:w="30"/>
+              <w:left w:type="dxa" w:w="40"/>
+              <w:bottom w:type="dxa" w:w="30"/>
+              <w:right w:type="dxa" w:w="40"/>
+            </w:tcMar>
+            <w:vAlign w:val="center"/>
+          </w:tcPr>
+          <w:p>
+            <w:pPr>
+              <w:jc w:val="center"/>
+            </w:pPr>
+            <w:r>
+              <w:rPr>
+                <w:b w:val="false"/>
+                <w:bCs w:val="false"/>
+                <w:sz w:val="14"/>
+                <w:szCs w:val="14"/>
+              </w:rPr>
+              <w:t xml:space="preserve">0</w:t>
             </w:r>
           </w:p>
         </w:tc>
         <w:tc>
           <w:tcPr>
             <w:tcW w:type="dxa" w:w="572"/>
-            <w:shd w:fill="DCE7F5" w:val="clear"/>
-            <w:tcMar>
-              <w:top w:type="dxa" w:w="30"/>
-              <w:left w:type="dxa" w:w="40"/>
-              <w:bottom w:type="dxa" w:w="30"/>
-              <w:right w:type="dxa" w:w="40"/>
-            </w:tcMar>
-            <w:vAlign w:val="center"/>
-          </w:tcPr>
-          <w:p>
-            <w:pPr>
-              <w:jc w:val="center"/>
-            </w:pPr>
-            <w:r>
-              <w:rPr>
-                <w:b w:val="false"/>
-                <w:bCs w:val="false"/>
-                <w:sz w:val="14"/>
-                <w:szCs w:val="14"/>
-              </w:rPr>
-              <w:t xml:space="preserve">1</w:t>
+            <w:shd w:fill="F6F6F6" w:val="clear"/>
+            <w:tcMar>
+              <w:top w:type="dxa" w:w="30"/>
+              <w:left w:type="dxa" w:w="40"/>
+              <w:bottom w:type="dxa" w:w="30"/>
+              <w:right w:type="dxa" w:w="40"/>
+            </w:tcMar>
+            <w:vAlign w:val="center"/>
+          </w:tcPr>
+          <w:p>
+            <w:pPr>
+              <w:jc w:val="center"/>
+            </w:pPr>
+            <w:r>
+              <w:rPr>
+                <w:b w:val="false"/>
+                <w:bCs w:val="false"/>
+                <w:sz w:val="14"/>
+                <w:szCs w:val="14"/>
+              </w:rPr>
+              <w:t xml:space="preserve">0</w:t>
             </w:r>
           </w:p>
         </w:tc>
         <w:tc>
           <w:tcPr>
             <w:tcW w:type="dxa" w:w="528"/>
-            <w:shd w:fill="DCE7F5" w:val="clear"/>
+            <w:shd w:fill="F6F6F6" w:val="clear"/>
             <w:tcMar>
               <w:top w:type="dxa" w:w="30"/>
               <w:left w:type="dxa" w:w="40"/>
@@ -9409,7 +10905,7 @@
         <w:tc>
           <w:tcPr>
             <w:tcW w:type="dxa" w:w="726"/>
-            <w:shd w:fill="DCE7F5" w:val="clear"/>
+            <w:shd w:fill="F6F6F6" w:val="clear"/>
             <w:tcMar>
               <w:top w:type="dxa" w:w="30"/>
               <w:left w:type="dxa" w:w="40"/>
@@ -9436,394 +10932,54 @@
         <w:tc>
           <w:tcPr>
             <w:tcW w:type="dxa" w:w="748"/>
-            <w:shd w:fill="DCE7F5" w:val="clear"/>
-            <w:tcMar>
-              <w:top w:type="dxa" w:w="30"/>
-              <w:left w:type="dxa" w:w="40"/>
-              <w:bottom w:type="dxa" w:w="30"/>
-              <w:right w:type="dxa" w:w="40"/>
-            </w:tcMar>
-            <w:vAlign w:val="center"/>
-          </w:tcPr>
-          <w:p>
-            <w:pPr>
-              <w:jc w:val="center"/>
-            </w:pPr>
-            <w:r>
-              <w:rPr>
-                <w:b w:val="false"/>
-                <w:bCs w:val="false"/>
-                <w:sz w:val="14"/>
-                <w:szCs w:val="14"/>
-              </w:rPr>
-              <w:t xml:space="preserve">0</w:t>
-            </w:r>
-          </w:p>
-        </w:tc>
-        <w:tc>
-          <w:tcPr>
-            <w:tcW w:type="dxa" w:w="770"/>
-            <w:shd w:fill="DCE7F5" w:val="clear"/>
-            <w:tcMar>
-              <w:top w:type="dxa" w:w="30"/>
-              <w:left w:type="dxa" w:w="40"/>
-              <w:bottom w:type="dxa" w:w="30"/>
-              <w:right w:type="dxa" w:w="40"/>
-            </w:tcMar>
-            <w:vAlign w:val="center"/>
-          </w:tcPr>
-          <w:p>
-            <w:pPr>
-              <w:jc w:val="center"/>
-            </w:pPr>
-            <w:r>
-              <w:rPr>
-                <w:b w:val="false"/>
-                <w:bCs w:val="false"/>
-                <w:sz w:val="14"/>
-                <w:szCs w:val="14"/>
-              </w:rPr>
-              <w:t xml:space="preserve">X</w:t>
-            </w:r>
-          </w:p>
-        </w:tc>
-      </w:tr>
-      <w:tr>
-        <w:tc>
-          <w:tcPr>
-            <w:tcW w:type="dxa" w:w="1815"/>
-            <w:tcMar>
-              <w:top w:type="dxa" w:w="30"/>
-              <w:left w:type="dxa" w:w="40"/>
-              <w:bottom w:type="dxa" w:w="30"/>
-              <w:right w:type="dxa" w:w="40"/>
-            </w:tcMar>
-            <w:vAlign w:val="center"/>
-          </w:tcPr>
-          <w:p>
-            <w:pPr>
-              <w:jc w:val="left"/>
-            </w:pPr>
-            <w:r>
-              <w:rPr>
-                <w:b/>
-                <w:bCs/>
-                <w:sz w:val="14"/>
-                <w:szCs w:val="14"/>
-              </w:rPr>
-              <w:t xml:space="preserve">lui</w:t>
-            </w:r>
-          </w:p>
-        </w:tc>
-        <w:tc>
-          <w:tcPr>
-            <w:tcW w:type="dxa" w:w="682"/>
-            <w:tcMar>
-              <w:top w:type="dxa" w:w="30"/>
-              <w:left w:type="dxa" w:w="40"/>
-              <w:bottom w:type="dxa" w:w="30"/>
-              <w:right w:type="dxa" w:w="40"/>
-            </w:tcMar>
-            <w:vAlign w:val="center"/>
-          </w:tcPr>
-          <w:p>
-            <w:pPr>
-              <w:jc w:val="center"/>
-            </w:pPr>
-            <w:r>
-              <w:rPr>
-                <w:b w:val="false"/>
-                <w:bCs w:val="false"/>
-                <w:sz w:val="14"/>
-                <w:szCs w:val="14"/>
-              </w:rPr>
-              <w:t xml:space="preserve">0</w:t>
-            </w:r>
-          </w:p>
-        </w:tc>
-        <w:tc>
-          <w:tcPr>
-            <w:tcW w:type="dxa" w:w="682"/>
-            <w:tcMar>
-              <w:top w:type="dxa" w:w="30"/>
-              <w:left w:type="dxa" w:w="40"/>
-              <w:bottom w:type="dxa" w:w="30"/>
-              <w:right w:type="dxa" w:w="40"/>
-            </w:tcMar>
-            <w:vAlign w:val="center"/>
-          </w:tcPr>
-          <w:p>
-            <w:pPr>
-              <w:jc w:val="center"/>
-            </w:pPr>
-            <w:r>
-              <w:rPr>
-                <w:b w:val="false"/>
-                <w:bCs w:val="false"/>
-                <w:sz w:val="14"/>
-                <w:szCs w:val="14"/>
-              </w:rPr>
-              <w:t xml:space="preserve">1</w:t>
-            </w:r>
-          </w:p>
-        </w:tc>
-        <w:tc>
-          <w:tcPr>
-            <w:tcW w:type="dxa" w:w="770"/>
-            <w:tcMar>
-              <w:top w:type="dxa" w:w="30"/>
-              <w:left w:type="dxa" w:w="40"/>
-              <w:bottom w:type="dxa" w:w="30"/>
-              <w:right w:type="dxa" w:w="40"/>
-            </w:tcMar>
-            <w:vAlign w:val="center"/>
-          </w:tcPr>
-          <w:p>
-            <w:pPr>
-              <w:jc w:val="center"/>
-            </w:pPr>
-            <w:r>
-              <w:rPr>
-                <w:b w:val="false"/>
-                <w:bCs w:val="false"/>
-                <w:sz w:val="14"/>
-                <w:szCs w:val="14"/>
-              </w:rPr>
-              <w:t xml:space="preserve">0</w:t>
-            </w:r>
-          </w:p>
-        </w:tc>
-        <w:tc>
-          <w:tcPr>
-            <w:tcW w:type="dxa" w:w="770"/>
-            <w:tcMar>
-              <w:top w:type="dxa" w:w="30"/>
-              <w:left w:type="dxa" w:w="40"/>
-              <w:bottom w:type="dxa" w:w="30"/>
-              <w:right w:type="dxa" w:w="40"/>
-            </w:tcMar>
-            <w:vAlign w:val="center"/>
-          </w:tcPr>
-          <w:p>
-            <w:pPr>
-              <w:jc w:val="center"/>
-            </w:pPr>
-            <w:r>
-              <w:rPr>
-                <w:b w:val="false"/>
-                <w:bCs w:val="false"/>
-                <w:sz w:val="14"/>
-                <w:szCs w:val="14"/>
-              </w:rPr>
-              <w:t xml:space="preserve">1</w:t>
-            </w:r>
-          </w:p>
-        </w:tc>
-        <w:tc>
-          <w:tcPr>
-            <w:tcW w:type="dxa" w:w="770"/>
-            <w:tcMar>
-              <w:top w:type="dxa" w:w="30"/>
-              <w:left w:type="dxa" w:w="40"/>
-              <w:bottom w:type="dxa" w:w="30"/>
-              <w:right w:type="dxa" w:w="40"/>
-            </w:tcMar>
-            <w:vAlign w:val="center"/>
-          </w:tcPr>
-          <w:p>
-            <w:pPr>
-              <w:jc w:val="center"/>
-            </w:pPr>
-            <w:r>
-              <w:rPr>
-                <w:b w:val="false"/>
-                <w:bCs w:val="false"/>
-                <w:sz w:val="14"/>
-                <w:szCs w:val="14"/>
-              </w:rPr>
-              <w:t xml:space="preserve">0</w:t>
-            </w:r>
-          </w:p>
-        </w:tc>
-        <w:tc>
-          <w:tcPr>
-            <w:tcW w:type="dxa" w:w="770"/>
-            <w:tcMar>
-              <w:top w:type="dxa" w:w="30"/>
-              <w:left w:type="dxa" w:w="40"/>
-              <w:bottom w:type="dxa" w:w="30"/>
-              <w:right w:type="dxa" w:w="40"/>
-            </w:tcMar>
-            <w:vAlign w:val="center"/>
-          </w:tcPr>
-          <w:p>
-            <w:pPr>
-              <w:jc w:val="center"/>
-            </w:pPr>
-            <w:r>
-              <w:rPr>
-                <w:b w:val="false"/>
-                <w:bCs w:val="false"/>
-                <w:sz w:val="14"/>
-                <w:szCs w:val="14"/>
-              </w:rPr>
-              <w:t xml:space="preserve">0, 0</w:t>
-            </w:r>
-          </w:p>
-        </w:tc>
-        <w:tc>
-          <w:tcPr>
-            <w:tcW w:type="dxa" w:w="616"/>
-            <w:tcMar>
-              <w:top w:type="dxa" w:w="30"/>
-              <w:left w:type="dxa" w:w="40"/>
-              <w:bottom w:type="dxa" w:w="30"/>
-              <w:right w:type="dxa" w:w="40"/>
-            </w:tcMar>
-            <w:vAlign w:val="center"/>
-          </w:tcPr>
-          <w:p>
-            <w:pPr>
-              <w:jc w:val="center"/>
-            </w:pPr>
-            <w:r>
-              <w:rPr>
-                <w:b w:val="false"/>
-                <w:bCs w:val="false"/>
-                <w:sz w:val="14"/>
-                <w:szCs w:val="14"/>
-              </w:rPr>
-              <w:t xml:space="preserve">0</w:t>
-            </w:r>
-          </w:p>
-        </w:tc>
-        <w:tc>
-          <w:tcPr>
-            <w:tcW w:type="dxa" w:w="572"/>
-            <w:tcMar>
-              <w:top w:type="dxa" w:w="30"/>
-              <w:left w:type="dxa" w:w="40"/>
-              <w:bottom w:type="dxa" w:w="30"/>
-              <w:right w:type="dxa" w:w="40"/>
-            </w:tcMar>
-            <w:vAlign w:val="center"/>
-          </w:tcPr>
-          <w:p>
-            <w:pPr>
-              <w:jc w:val="center"/>
-            </w:pPr>
-            <w:r>
-              <w:rPr>
-                <w:b w:val="false"/>
-                <w:bCs w:val="false"/>
-                <w:sz w:val="14"/>
-                <w:szCs w:val="14"/>
-              </w:rPr>
-              <w:t xml:space="preserve">0</w:t>
-            </w:r>
-          </w:p>
-        </w:tc>
-        <w:tc>
-          <w:tcPr>
-            <w:tcW w:type="dxa" w:w="528"/>
-            <w:tcMar>
-              <w:top w:type="dxa" w:w="30"/>
-              <w:left w:type="dxa" w:w="40"/>
-              <w:bottom w:type="dxa" w:w="30"/>
-              <w:right w:type="dxa" w:w="40"/>
-            </w:tcMar>
-            <w:vAlign w:val="center"/>
-          </w:tcPr>
-          <w:p>
-            <w:pPr>
-              <w:jc w:val="center"/>
-            </w:pPr>
-            <w:r>
-              <w:rPr>
-                <w:b w:val="false"/>
-                <w:bCs w:val="false"/>
-                <w:sz w:val="14"/>
-                <w:szCs w:val="14"/>
-              </w:rPr>
-              <w:t xml:space="preserve">0</w:t>
-            </w:r>
-          </w:p>
-        </w:tc>
-        <w:tc>
-          <w:tcPr>
-            <w:tcW w:type="dxa" w:w="726"/>
-            <w:tcMar>
-              <w:top w:type="dxa" w:w="30"/>
-              <w:left w:type="dxa" w:w="40"/>
-              <w:bottom w:type="dxa" w:w="30"/>
-              <w:right w:type="dxa" w:w="40"/>
-            </w:tcMar>
-            <w:vAlign w:val="center"/>
-          </w:tcPr>
-          <w:p>
-            <w:pPr>
-              <w:jc w:val="center"/>
-            </w:pPr>
-            <w:r>
-              <w:rPr>
-                <w:b w:val="false"/>
-                <w:bCs w:val="false"/>
-                <w:sz w:val="14"/>
-                <w:szCs w:val="14"/>
-              </w:rPr>
-              <w:t xml:space="preserve">0</w:t>
-            </w:r>
-          </w:p>
-        </w:tc>
-        <w:tc>
-          <w:tcPr>
-            <w:tcW w:type="dxa" w:w="748"/>
-            <w:tcMar>
-              <w:top w:type="dxa" w:w="30"/>
-              <w:left w:type="dxa" w:w="40"/>
-              <w:bottom w:type="dxa" w:w="30"/>
-              <w:right w:type="dxa" w:w="40"/>
-            </w:tcMar>
-            <w:vAlign w:val="center"/>
-          </w:tcPr>
-          <w:p>
-            <w:pPr>
-              <w:jc w:val="center"/>
-            </w:pPr>
-            <w:r>
-              <w:rPr>
-                <w:b w:val="false"/>
-                <w:bCs w:val="false"/>
-                <w:sz w:val="14"/>
-                <w:szCs w:val="14"/>
-              </w:rPr>
-              <w:t xml:space="preserve">0</w:t>
-            </w:r>
-          </w:p>
-        </w:tc>
-        <w:tc>
-          <w:tcPr>
-            <w:tcW w:type="dxa" w:w="770"/>
-            <w:tcMar>
-              <w:top w:type="dxa" w:w="30"/>
-              <w:left w:type="dxa" w:w="40"/>
-              <w:bottom w:type="dxa" w:w="30"/>
-              <w:right w:type="dxa" w:w="40"/>
-            </w:tcMar>
-            <w:vAlign w:val="center"/>
-          </w:tcPr>
-          <w:p>
-            <w:pPr>
-              <w:jc w:val="center"/>
-            </w:pPr>
-            <w:r>
-              <w:rPr>
-                <w:b w:val="false"/>
-                <w:bCs w:val="false"/>
-                <w:sz w:val="14"/>
-                <w:szCs w:val="14"/>
-              </w:rPr>
-              <w:t xml:space="preserve">1110</w:t>
+            <w:shd w:fill="F6F6F6" w:val="clear"/>
+            <w:tcMar>
+              <w:top w:type="dxa" w:w="30"/>
+              <w:left w:type="dxa" w:w="40"/>
+              <w:bottom w:type="dxa" w:w="30"/>
+              <w:right w:type="dxa" w:w="40"/>
+            </w:tcMar>
+            <w:vAlign w:val="center"/>
+          </w:tcPr>
+          <w:p>
+            <w:pPr>
+              <w:jc w:val="center"/>
+            </w:pPr>
+            <w:r>
+              <w:rPr>
+                <w:b w:val="false"/>
+                <w:bCs w:val="false"/>
+                <w:sz w:val="14"/>
+                <w:szCs w:val="14"/>
+              </w:rPr>
+              <w:t xml:space="preserve">0</w:t>
+            </w:r>
+          </w:p>
+        </w:tc>
+        <w:tc>
+          <w:tcPr>
+            <w:tcW w:type="dxa" w:w="770"/>
+            <w:shd w:fill="F6F6F6" w:val="clear"/>
+            <w:tcMar>
+              <w:top w:type="dxa" w:w="30"/>
+              <w:left w:type="dxa" w:w="40"/>
+              <w:bottom w:type="dxa" w:w="30"/>
+              <w:right w:type="dxa" w:w="40"/>
+            </w:tcMar>
+            <w:vAlign w:val="center"/>
+          </w:tcPr>
+          <w:p>
+            <w:pPr>
+              <w:jc w:val="center"/>
+            </w:pPr>
+            <w:r>
+              <w:rPr>
+                <w:b w:val="false"/>
+                <w:bCs w:val="false"/>
+                <w:sz w:val="14"/>
+                <w:szCs w:val="14"/>
+              </w:rPr>
+              <w:t xml:space="preserve">01110</w:t>
             </w:r>
           </w:p>
         </w:tc>
@@ -10443,6 +11599,216 @@
                 <w:szCs w:val="16"/>
               </w:rPr>
               <w:t xml:space="preserve">opcode 000000, rd 01011, function field 010000</w:t>
+            </w:r>
+          </w:p>
+        </w:tc>
+      </w:tr>
+      <w:tr>
+        <w:tc>
+          <w:tcPr>
+            <w:tcW w:type="dxa" w:w="2500"/>
+            <w:tcMar>
+              <w:top w:type="dxa" w:w="45"/>
+              <w:left w:type="dxa" w:w="90"/>
+              <w:bottom w:type="dxa" w:w="45"/>
+              <w:right w:type="dxa" w:w="90"/>
+            </w:tcMar>
+          </w:tcPr>
+          <w:p>
+            <w:r>
+              <w:rPr>
+                <w:rFonts w:ascii="Consolas" w:cs="Consolas" w:eastAsia="Consolas" w:hAnsi="Consolas"/>
+                <w:b w:val="false"/>
+                <w:bCs w:val="false"/>
+                <w:sz w:val="16"/>
+                <w:szCs w:val="16"/>
+              </w:rPr>
+              <w:t xml:space="preserve">min $s0, $t0, $t1</w:t>
+            </w:r>
+          </w:p>
+        </w:tc>
+        <w:tc>
+          <w:tcPr>
+            <w:tcW w:type="dxa" w:w="2200"/>
+            <w:tcMar>
+              <w:top w:type="dxa" w:w="45"/>
+              <w:left w:type="dxa" w:w="90"/>
+              <w:bottom w:type="dxa" w:w="45"/>
+              <w:right w:type="dxa" w:w="90"/>
+            </w:tcMar>
+          </w:tcPr>
+          <w:p>
+            <w:r>
+              <w:rPr>
+                <w:rFonts w:ascii="Consolas" w:cs="Consolas" w:eastAsia="Consolas" w:hAnsi="Consolas"/>
+                <w:b w:val="false"/>
+                <w:bCs w:val="false"/>
+                <w:sz w:val="16"/>
+                <w:szCs w:val="16"/>
+              </w:rPr>
+              <w:t xml:space="preserve">0x0109802C</w:t>
+            </w:r>
+          </w:p>
+        </w:tc>
+        <w:tc>
+          <w:tcPr>
+            <w:tcW w:type="dxa" w:w="5500"/>
+            <w:tcMar>
+              <w:top w:type="dxa" w:w="45"/>
+              <w:left w:type="dxa" w:w="90"/>
+              <w:bottom w:type="dxa" w:w="45"/>
+              <w:right w:type="dxa" w:w="90"/>
+            </w:tcMar>
+          </w:tcPr>
+          <w:p>
+            <w:r>
+              <w:rPr>
+                <w:b w:val="false"/>
+                <w:bCs w:val="false"/>
+                <w:sz w:val="16"/>
+                <w:szCs w:val="16"/>
+              </w:rPr>
+              <w:t xml:space="preserve">opcode 000000, rs 01000, rt 01001, rd 10000, function field 101100</w:t>
+            </w:r>
+          </w:p>
+        </w:tc>
+      </w:tr>
+      <w:tr>
+        <w:tc>
+          <w:tcPr>
+            <w:tcW w:type="dxa" w:w="2500"/>
+            <w:tcMar>
+              <w:top w:type="dxa" w:w="45"/>
+              <w:left w:type="dxa" w:w="90"/>
+              <w:bottom w:type="dxa" w:w="45"/>
+              <w:right w:type="dxa" w:w="90"/>
+            </w:tcMar>
+          </w:tcPr>
+          <w:p>
+            <w:r>
+              <w:rPr>
+                <w:rFonts w:ascii="Consolas" w:cs="Consolas" w:eastAsia="Consolas" w:hAnsi="Consolas"/>
+                <w:b w:val="false"/>
+                <w:bCs w:val="false"/>
+                <w:sz w:val="16"/>
+                <w:szCs w:val="16"/>
+              </w:rPr>
+              <w:t xml:space="preserve">max $s1, $t0, $t1</w:t>
+            </w:r>
+          </w:p>
+        </w:tc>
+        <w:tc>
+          <w:tcPr>
+            <w:tcW w:type="dxa" w:w="2200"/>
+            <w:tcMar>
+              <w:top w:type="dxa" w:w="45"/>
+              <w:left w:type="dxa" w:w="90"/>
+              <w:bottom w:type="dxa" w:w="45"/>
+              <w:right w:type="dxa" w:w="90"/>
+            </w:tcMar>
+          </w:tcPr>
+          <w:p>
+            <w:r>
+              <w:rPr>
+                <w:rFonts w:ascii="Consolas" w:cs="Consolas" w:eastAsia="Consolas" w:hAnsi="Consolas"/>
+                <w:b w:val="false"/>
+                <w:bCs w:val="false"/>
+                <w:sz w:val="16"/>
+                <w:szCs w:val="16"/>
+              </w:rPr>
+              <w:t xml:space="preserve">0x0109882D</w:t>
+            </w:r>
+          </w:p>
+        </w:tc>
+        <w:tc>
+          <w:tcPr>
+            <w:tcW w:type="dxa" w:w="5500"/>
+            <w:tcMar>
+              <w:top w:type="dxa" w:w="45"/>
+              <w:left w:type="dxa" w:w="90"/>
+              <w:bottom w:type="dxa" w:w="45"/>
+              <w:right w:type="dxa" w:w="90"/>
+            </w:tcMar>
+          </w:tcPr>
+          <w:p>
+            <w:r>
+              <w:rPr>
+                <w:b w:val="false"/>
+                <w:bCs w:val="false"/>
+                <w:sz w:val="16"/>
+                <w:szCs w:val="16"/>
+              </w:rPr>
+              <w:t xml:space="preserve">opcode 000000, rs 01000, rt 01001, rd 10001, function field 101101</w:t>
+            </w:r>
+          </w:p>
+        </w:tc>
+      </w:tr>
+      <w:tr>
+        <w:tc>
+          <w:tcPr>
+            <w:tcW w:type="dxa" w:w="2500"/>
+            <w:tcMar>
+              <w:top w:type="dxa" w:w="45"/>
+              <w:left w:type="dxa" w:w="90"/>
+              <w:bottom w:type="dxa" w:w="45"/>
+              <w:right w:type="dxa" w:w="90"/>
+            </w:tcMar>
+          </w:tcPr>
+          <w:p>
+            <w:r>
+              <w:rPr>
+                <w:rFonts w:ascii="Consolas" w:cs="Consolas" w:eastAsia="Consolas" w:hAnsi="Consolas"/>
+                <w:b w:val="false"/>
+                <w:bCs w:val="false"/>
+                <w:sz w:val="16"/>
+                <w:szCs w:val="16"/>
+              </w:rPr>
+              <w:t xml:space="preserve">sum $s2, $t0, $t1</w:t>
+            </w:r>
+          </w:p>
+        </w:tc>
+        <w:tc>
+          <w:tcPr>
+            <w:tcW w:type="dxa" w:w="2200"/>
+            <w:tcMar>
+              <w:top w:type="dxa" w:w="45"/>
+              <w:left w:type="dxa" w:w="90"/>
+              <w:bottom w:type="dxa" w:w="45"/>
+              <w:right w:type="dxa" w:w="90"/>
+            </w:tcMar>
+          </w:tcPr>
+          <w:p>
+            <w:r>
+              <w:rPr>
+                <w:rFonts w:ascii="Consolas" w:cs="Consolas" w:eastAsia="Consolas" w:hAnsi="Consolas"/>
+                <w:b w:val="false"/>
+                <w:bCs w:val="false"/>
+                <w:sz w:val="16"/>
+                <w:szCs w:val="16"/>
+              </w:rPr>
+              <w:t xml:space="preserve">0x0109902E</w:t>
+            </w:r>
+          </w:p>
+        </w:tc>
+        <w:tc>
+          <w:tcPr>
+            <w:tcW w:type="dxa" w:w="5500"/>
+            <w:tcMar>
+              <w:top w:type="dxa" w:w="45"/>
+              <w:left w:type="dxa" w:w="90"/>
+              <w:bottom w:type="dxa" w:w="45"/>
+              <w:right w:type="dxa" w:w="90"/>
+            </w:tcMar>
+          </w:tcPr>
+          <w:p>
+            <w:r>
+              <w:rPr>
+                <w:b w:val="false"/>
+                <w:bCs w:val="false"/>
+                <w:sz w:val="16"/>
+                <w:szCs w:val="16"/>
+              </w:rPr>
+              <w:t xml:space="preserve">opcode 000000, rs 01000, rt 01001, rd 10010, function field 101110</w:t>
             </w:r>
           </w:p>
         </w:tc>
@@ -10629,7 +11995,7 @@
           <w:szCs w:val="13"/>
         </w:rPr>
         <w:br/>
-        <w:t xml:space="preserve">    ALUControl &lt;= 4'b0000;</w:t>
+        <w:t xml:space="preserve">    ALUControl &lt;= 5'b00000;</w:t>
       </w:r>
       <w:r>
         <w:rPr>
@@ -10665,7 +12031,7 @@
           <w:szCs w:val="13"/>
         </w:rPr>
         <w:br/>
-        <w:t xml:space="preserve">    ALUControl &lt;= 4'b0000;</w:t>
+        <w:t xml:space="preserve">    ALUControl &lt;= 5'b00000;</w:t>
       </w:r>
       <w:r>
         <w:rPr>
@@ -10701,7 +12067,7 @@
           <w:szCs w:val="13"/>
         </w:rPr>
         <w:br/>
-        <w:t xml:space="preserve">    ALUControl &lt;= 4'b0000;</w:t>
+        <w:t xml:space="preserve">    ALUControl &lt;= 5'b00000;</w:t>
       </w:r>
       <w:r>
         <w:rPr>
@@ -10737,7 +12103,7 @@
           <w:szCs w:val="13"/>
         </w:rPr>
         <w:br/>
-        <w:t xml:space="preserve">    ALUControl &lt;= 4'b0000;</w:t>
+        <w:t xml:space="preserve">    ALUControl &lt;= 5'b00000;</w:t>
       </w:r>
       <w:r>
         <w:rPr>
@@ -10756,6 +12122,96 @@
         </w:rPr>
         <w:br/>
         <w:t xml:space="preserve">  end</w:t>
+      </w:r>
+    </w:p>
+    <w:p>
+      <w:pPr>
+        <w:spacing w:after="100" w:line="230"/>
+        <w:jc w:val="both"/>
+      </w:pPr>
+      <w:r>
+        <w:rPr>
+          <w:sz w:val="19"/>
+          <w:szCs w:val="19"/>
+        </w:rPr>
+        <w:t xml:space="preserve">MIN, MAX and SUM sit in the same R type branch but are far simpler, because selecting an ALU operation is the only thing they need.</w:t>
+      </w:r>
+    </w:p>
+    <w:p>
+      <w:pPr>
+        <w:shd w:fill="F4F4F4" w:val="clear"/>
+        <w:spacing w:after="90" w:line="195"/>
+      </w:pPr>
+      <w:r>
+        <w:rPr>
+          <w:rFonts w:ascii="Consolas" w:cs="Consolas" w:eastAsia="Consolas" w:hAnsi="Consolas"/>
+          <w:sz w:val="13"/>
+          <w:szCs w:val="13"/>
+        </w:rPr>
+        <w:t xml:space="preserve">6'b101100: ALUControl &lt;= 5'b10000;  // MIN</w:t>
+      </w:r>
+      <w:r>
+        <w:rPr>
+          <w:rFonts w:ascii="Consolas" w:cs="Consolas" w:eastAsia="Consolas" w:hAnsi="Consolas"/>
+          <w:sz w:val="13"/>
+          <w:szCs w:val="13"/>
+        </w:rPr>
+        <w:br/>
+        <w:t xml:space="preserve">6'b101101: ALUControl &lt;= 5'b10001;  // MAX</w:t>
+      </w:r>
+      <w:r>
+        <w:rPr>
+          <w:rFonts w:ascii="Consolas" w:cs="Consolas" w:eastAsia="Consolas" w:hAnsi="Consolas"/>
+          <w:sz w:val="13"/>
+          <w:szCs w:val="13"/>
+        </w:rPr>
+        <w:br/>
+        <w:t xml:space="preserve">6'b101110: ALUControl &lt;= 5'b10010;  // SUM</w:t>
+      </w:r>
+    </w:p>
+    <w:p>
+      <w:pPr>
+        <w:spacing w:after="100" w:line="230"/>
+        <w:jc w:val="both"/>
+      </w:pPr>
+      <w:r>
+        <w:rPr>
+          <w:sz w:val="19"/>
+          <w:szCs w:val="19"/>
+        </w:rPr>
+        <w:t xml:space="preserve">The matching ALU entries, where a and b are the two source register values, read as follows. Both comparisons are wrapped in a signed cast, which is what makes negative operands behave correctly.</w:t>
+      </w:r>
+    </w:p>
+    <w:p>
+      <w:pPr>
+        <w:shd w:fill="F4F4F4" w:val="clear"/>
+        <w:spacing w:after="90" w:line="195"/>
+      </w:pPr>
+      <w:r>
+        <w:rPr>
+          <w:rFonts w:ascii="Consolas" w:cs="Consolas" w:eastAsia="Consolas" w:hAnsi="Consolas"/>
+          <w:sz w:val="13"/>
+          <w:szCs w:val="13"/>
+        </w:rPr>
+        <w:t xml:space="preserve">5'b10000: y = $signed(a) &lt; $signed(b) ? a : b;</w:t>
+      </w:r>
+      <w:r>
+        <w:rPr>
+          <w:rFonts w:ascii="Consolas" w:cs="Consolas" w:eastAsia="Consolas" w:hAnsi="Consolas"/>
+          <w:sz w:val="13"/>
+          <w:szCs w:val="13"/>
+        </w:rPr>
+        <w:br/>
+        <w:t xml:space="preserve">5'b10001: y = $signed(a) &gt; $signed(b) ? a : b;</w:t>
+      </w:r>
+      <w:r>
+        <w:rPr>
+          <w:rFonts w:ascii="Consolas" w:cs="Consolas" w:eastAsia="Consolas" w:hAnsi="Consolas"/>
+          <w:sz w:val="13"/>
+          <w:szCs w:val="13"/>
+        </w:rPr>
+        <w:br/>
+        <w:t xml:space="preserve">5'b10010: y = a + b;</w:t>
       </w:r>
     </w:p>
     <w:p>
@@ -10800,7 +12256,7 @@
           <w:szCs w:val="13"/>
         </w:rPr>
         <w:br/>
-        <w:t xml:space="preserve">    ALUControl &lt;= 4'b0000;</w:t>
+        <w:t xml:space="preserve">    ALUControl &lt;= 5'b00000;</w:t>
       </w:r>
       <w:r>
         <w:rPr>
@@ -11002,6 +12458,170 @@
     </w:p>
     <w:p>
       <w:pPr>
+        <w:spacing w:after="100" w:line="230"/>
+        <w:ind w:firstLine="200"/>
+        <w:jc w:val="both"/>
+      </w:pPr>
+      <w:r>
+        <w:rPr>
+          <w:sz w:val="19"/>
+          <w:szCs w:val="19"/>
+        </w:rPr>
+        <w:t xml:space="preserve">The third program tests MIN, MAX and SUM, and it also writes its answers into data memory so that the results survive somewhere we can inspect after the run has finished. It computes min and max and sum of 25 and 7, and then repeats min and max using 25 against negative 12.</w:t>
+      </w:r>
+    </w:p>
+    <w:p>
+      <w:pPr>
+        <w:spacing w:after="100" w:line="230"/>
+        <w:ind w:firstLine="200"/>
+        <w:jc w:val="both"/>
+      </w:pPr>
+      <w:r>
+        <w:rPr>
+          <w:sz w:val="19"/>
+          <w:szCs w:val="19"/>
+        </w:rPr>
+        <w:t xml:space="preserve">That negative operand is deliberate. A test built only from positive numbers would pass whether the comparison was signed or unsigned, so it would prove very little. Negative 12 read as an unsigned 32 bit number is roughly 4.29 billion, which is larger than 25 rather than smaller. So an unsigned comparison would report the minimum of 25 and negative 12 as 25, and the maximum of negative 12 and 7 as negative 12. Our processor returned negative 12 and 7 respectively, which is only possible with a correctly signed comparison.</w:t>
+      </w:r>
+    </w:p>
+    <w:p>
+      <w:pPr>
+        <w:spacing w:after="100" w:line="230"/>
+        <w:ind w:firstLine="200"/>
+        <w:jc w:val="both"/>
+      </w:pPr>
+      <w:r>
+        <w:rPr>
+          <w:sz w:val="19"/>
+          <w:szCs w:val="19"/>
+        </w:rPr>
+        <w:t xml:space="preserve">The register results were min of 25 and 7 gives 7, max of 25 and 7 gives 25, sum of 25 and 7 gives 32, min of 25 and negative 12 gives negative 12, and max of negative 12 and 7 gives 7. All five match hand calculation.</w:t>
+      </w:r>
+    </w:p>
+    <w:p>
+      <w:pPr>
+        <w:spacing w:after="100" w:line="230"/>
+        <w:ind w:firstLine="200"/>
+        <w:jc w:val="both"/>
+      </w:pPr>
+      <w:r>
+        <w:rPr>
+          <w:sz w:val="19"/>
+          <w:szCs w:val="19"/>
+        </w:rPr>
+        <w:t xml:space="preserve">The five values were then stored to consecutive words of data memory, and the testbench dumped the whole of data memory to a file at the end of the run. The relevant part of that dump is shown below. Every word outside the first five is zero, which is itself a useful check, because it confirms the stores landed exactly where they were addressed and did not disturb anything else.</w:t>
+      </w:r>
+    </w:p>
+    <w:p>
+      <w:pPr>
+        <w:shd w:fill="F4F4F4" w:val="clear"/>
+        <w:spacing w:after="90" w:line="195"/>
+      </w:pPr>
+      <w:r>
+        <w:rPr>
+          <w:rFonts w:ascii="Consolas" w:cs="Consolas" w:eastAsia="Consolas" w:hAnsi="Consolas"/>
+          <w:sz w:val="13"/>
+          <w:szCs w:val="13"/>
+        </w:rPr>
+        <w:t xml:space="preserve">// 0x00000000</w:t>
+      </w:r>
+      <w:r>
+        <w:rPr>
+          <w:rFonts w:ascii="Consolas" w:cs="Consolas" w:eastAsia="Consolas" w:hAnsi="Consolas"/>
+          <w:sz w:val="13"/>
+          <w:szCs w:val="13"/>
+        </w:rPr>
+        <w:br/>
+        <w:t xml:space="preserve">00000007     min(25, 7)   = 7</w:t>
+      </w:r>
+      <w:r>
+        <w:rPr>
+          <w:rFonts w:ascii="Consolas" w:cs="Consolas" w:eastAsia="Consolas" w:hAnsi="Consolas"/>
+          <w:sz w:val="13"/>
+          <w:szCs w:val="13"/>
+        </w:rPr>
+        <w:br/>
+        <w:t xml:space="preserve">00000019     max(25, 7)   = 25</w:t>
+      </w:r>
+      <w:r>
+        <w:rPr>
+          <w:rFonts w:ascii="Consolas" w:cs="Consolas" w:eastAsia="Consolas" w:hAnsi="Consolas"/>
+          <w:sz w:val="13"/>
+          <w:szCs w:val="13"/>
+        </w:rPr>
+        <w:br/>
+        <w:t xml:space="preserve">00000020     sum(25, 7)   = 32</w:t>
+      </w:r>
+      <w:r>
+        <w:rPr>
+          <w:rFonts w:ascii="Consolas" w:cs="Consolas" w:eastAsia="Consolas" w:hAnsi="Consolas"/>
+          <w:sz w:val="13"/>
+          <w:szCs w:val="13"/>
+        </w:rPr>
+        <w:br/>
+        <w:t xml:space="preserve">fffffff4     min(25, -12) = -12</w:t>
+      </w:r>
+      <w:r>
+        <w:rPr>
+          <w:rFonts w:ascii="Consolas" w:cs="Consolas" w:eastAsia="Consolas" w:hAnsi="Consolas"/>
+          <w:sz w:val="13"/>
+          <w:szCs w:val="13"/>
+        </w:rPr>
+        <w:br/>
+        <w:t xml:space="preserve">00000007     max(-12, 7)  = 7</w:t>
+      </w:r>
+      <w:r>
+        <w:rPr>
+          <w:rFonts w:ascii="Consolas" w:cs="Consolas" w:eastAsia="Consolas" w:hAnsi="Consolas"/>
+          <w:sz w:val="13"/>
+          <w:szCs w:val="13"/>
+        </w:rPr>
+        <w:br/>
+        <w:t xml:space="preserve">00000000</w:t>
+      </w:r>
+      <w:r>
+        <w:rPr>
+          <w:rFonts w:ascii="Consolas" w:cs="Consolas" w:eastAsia="Consolas" w:hAnsi="Consolas"/>
+          <w:sz w:val="13"/>
+          <w:szCs w:val="13"/>
+        </w:rPr>
+        <w:br/>
+        <w:t xml:space="preserve">00000000</w:t>
+      </w:r>
+      <w:r>
+        <w:rPr>
+          <w:rFonts w:ascii="Consolas" w:cs="Consolas" w:eastAsia="Consolas" w:hAnsi="Consolas"/>
+          <w:sz w:val="13"/>
+          <w:szCs w:val="13"/>
+        </w:rPr>
+        <w:br/>
+        <w:t xml:space="preserve">00000000</w:t>
+      </w:r>
+      <w:r>
+        <w:rPr>
+          <w:rFonts w:ascii="Consolas" w:cs="Consolas" w:eastAsia="Consolas" w:hAnsi="Consolas"/>
+          <w:sz w:val="13"/>
+          <w:szCs w:val="13"/>
+        </w:rPr>
+        <w:br/>
+        <w:t xml:space="preserve">...           all remaining words are zero</w:t>
+      </w:r>
+    </w:p>
+    <w:p>
+      <w:pPr>
+        <w:spacing w:after="100" w:line="230"/>
+        <w:jc w:val="both"/>
+      </w:pPr>
+      <w:r>
+        <w:rPr>
+          <w:sz w:val="19"/>
+          <w:szCs w:val="19"/>
+        </w:rPr>
+        <w:t xml:space="preserve">The fourth entry is worth a second look. Negative 12 stored as a 32 bit two's complement value is fffffff4 in hexadecimal, which is what appears in memory. This confirms the negative result was not only computed correctly but also written to memory intact.</w:t>
+      </w:r>
+    </w:p>
+    <w:p>
+      <w:pPr>
         <w:spacing w:after="110" w:before="220"/>
         <w:jc w:val="center"/>
       </w:pPr>
@@ -11095,7 +12715,7 @@
           <w:sz w:val="19"/>
           <w:szCs w:val="19"/>
         </w:rPr>
-        <w:t xml:space="preserve">We added five instructions to the single cycle MIPS design we were given. JAL and JR were the two required by the assignment, and MULT, MFHI and MFLO followed afterwards. Two of the five needed only wider versions of muxes that already existed, one needed a new path into the program counter, and the multiply family needed a multiplier and a new pair of registers.</w:t>
+        <w:t xml:space="preserve">We added eight instructions to the single cycle MIPS design we were given. JAL and JR were the two required by the assignment, MULT, MFHI and MFLO followed afterwards, and MIN, MAX and SUM were added last as custom instructions of our own. The amount of hardware each one needed varied a great deal. MIN, MAX and SUM needed no new control signals at all and only a wider ALU control field. JAL needed wider versions of muxes that already existed. JR needed a new path into the program counter. The multiply family needed a multiplier and a new pair of registers.</w:t>
       </w:r>
     </w:p>
     <w:p>

</xml_diff>